<commit_message>
v1.1: 沒裝 Tools 的 VM 也能納管(-ResolveDns / -DnsSuffix / -TcpPort)
- 網路可達優先於 Tools 判定:實測移除 Tools 後 vCenter 仍回報舊的
  toolsNotRunning/guestToolsUnmanaged,只看 Tools 會把正常 VM 一直重開
- -ResolveDns:VM 名稱查 DNS 取 IP;-TcpPort:TCP 連線判定,不受 ICMP 被擋影響
- 實測:無 Tools VM 以 DNS + TCP 22 監看,kernel panic → 硬重置 → 恢復
- docs 更新(docx 18 頁 / pptx 24 頁)

Co-Authored-By: Claude Opus 5 <noreply@anthropic.com>
</commit_message>
<xml_diff>
--- a/docs/Watch-VMHealth-使用手冊與實測報告.docx
+++ b/docs/Watch-VMHealth-使用手冊與實測報告.docx
@@ -65,7 +65,7 @@
           <w:sz w:val="20"/>
           <w:szCs w:val="20"/>
         </w:rPr>
-        <w:t xml:space="preserve">版本 1.0　　2026-09-14</w:t>
+        <w:t xml:space="preserve">版本 1.1　　2026-09-15</w:t>
       </w:r>
     </w:p>
     <w:p>
@@ -499,7 +499,23 @@
           <w:sz w:val="19"/>
           <w:szCs w:val="19"/>
         </w:rPr>
-        <w:t xml:space="preserve">7.4 實測抓到並修正的問題</w:t>
+        <w:t xml:space="preserve">7.4 沒裝 Tools 的 VM：DNS + TCP port 判定</w:t>
+      </w:r>
+    </w:p>
+    <w:p>
+      <w:pPr>
+        <w:spacing w:after="40" w:before="0"/>
+        <w:ind w:left="480"/>
+      </w:pPr>
+      <w:r>
+        <w:rPr>
+          <w:rFonts w:ascii="Microsoft JhengHei" w:cs="Microsoft JhengHei" w:eastAsia="Microsoft JhengHei" w:hAnsi="Microsoft JhengHei"/>
+          <w:b w:val="false"/>
+          <w:bCs w:val="false"/>
+          <w:sz w:val="19"/>
+          <w:szCs w:val="19"/>
+        </w:rPr>
+        <w:t xml:space="preserve">7.5 實測抓到並修正的問題</w:t>
       </w:r>
     </w:p>
     <w:p>
@@ -1766,7 +1782,7 @@
                 <w:sz w:val="19"/>
                 <w:szCs w:val="19"/>
               </w:rPr>
-              <w:t xml:space="preserve">網路不通（需 -Ping）</w:t>
+              <w:t xml:space="preserve">網路不通（需 -Ping / -TcpPort）</w:t>
             </w:r>
           </w:p>
         </w:tc>
@@ -1790,7 +1806,7 @@
                 <w:sz w:val="19"/>
                 <w:szCs w:val="19"/>
               </w:rPr>
-              <w:t xml:space="preserve">guest IP（Tools 回報或 -PingMap 指定）ICMP 不通</w:t>
+              <w:t xml:space="preserve">guest IP ICMP 不通、且指定的 TCP port 都連不上（IP 來源：-PingMap &gt; Tools 回報 &gt; -ResolveDns 查 DNS）</w:t>
             </w:r>
           </w:p>
         </w:tc>
@@ -1814,7 +1830,7 @@
                 <w:sz w:val="19"/>
                 <w:szCs w:val="19"/>
               </w:rPr>
-              <w:t xml:space="preserve">Tools 活著 → Restart-VMGuest（正常重開）</w:t>
+              <w:t xml:space="preserve">Tools 活著 → Restart-VMGuest（正常重開）；否則硬重置</w:t>
             </w:r>
           </w:p>
         </w:tc>
@@ -1909,7 +1925,43 @@
           <w:sz w:val="20"/>
           <w:szCs w:val="20"/>
         </w:rPr>
-        <w:t xml:space="preserve">以下情況一律略過、不動手：VM 為 suspended；主機 disconnected / not responding（屬主機問題）；沒裝 Tools 也沒有 ping 目標（無法判定）；開機或重開後尚在寬限期內。</w:t>
+        <w:t xml:space="preserve">以下情況一律略過、不動手：VM 為 suspended；主機 disconnected / not responding（屬主機問題）；沒裝 Tools 也沒有可達性目標（無法判定）；開機或重開後尚在寬限期內。</w:t>
+      </w:r>
+    </w:p>
+    <w:p>
+      <w:pPr>
+        <w:shd w:fill="E8F0F4" w:val="clear"/>
+        <w:spacing w:after="140" w:before="60"/>
+        <w:ind w:left="120" w:right="120"/>
+      </w:pPr>
+      <w:r>
+        <w:rPr>
+          <w:rFonts w:ascii="Microsoft JhengHei" w:cs="Microsoft JhengHei" w:eastAsia="Microsoft JhengHei" w:hAnsi="Microsoft JhengHei"/>
+          <w:b/>
+          <w:bCs/>
+          <w:color w:val="1F3864"/>
+          <w:sz w:val="20"/>
+          <w:szCs w:val="20"/>
+        </w:rPr>
+        <w:t xml:space="preserve">重要　</w:t>
+      </w:r>
+      <w:r>
+        <w:rPr>
+          <w:rFonts w:ascii="Microsoft JhengHei" w:cs="Microsoft JhengHei" w:eastAsia="Microsoft JhengHei" w:hAnsi="Microsoft JhengHei"/>
+          <w:b/>
+          <w:bCs/>
+          <w:sz w:val="20"/>
+          <w:szCs w:val="20"/>
+        </w:rPr>
+        <w:t xml:space="preserve">網路可達優先於 Tools 判定。</w:t>
+      </w:r>
+      <w:r>
+        <w:rPr>
+          <w:rFonts w:ascii="Microsoft JhengHei" w:cs="Microsoft JhengHei" w:eastAsia="Microsoft JhengHei" w:hAnsi="Microsoft JhengHei"/>
+          <w:sz w:val="20"/>
+          <w:szCs w:val="20"/>
+        </w:rPr>
+        <w:t xml:space="preserve">有設定 -Ping / -TcpPort 且目標可達時，一律視為健康，不管 Tools 狀態。原因見 7.5：Tools 移除後 vCenter 仍會回報「已安裝但未執行」的舊值，若只看 Tools 會把沒 Tools 但服務正常的 VM 當成當機。</w:t>
       </w:r>
     </w:p>
     <w:p>
@@ -3439,7 +3491,7 @@
                 <w:sz w:val="19"/>
                 <w:szCs w:val="19"/>
               </w:rPr>
-              <w:t xml:space="preserve">建議安裝 VMware Tools（open-vm-tools 亦可）；沒有 Tools 的 VM 須以 -PingMap 指定 IP 才能判定</w:t>
+              <w:t xml:space="preserve">建議安裝 VMware Tools（open-vm-tools 亦可）；沒有 Tools 的 VM 須有可達性目標（-PingMap 指定 IP，或 -ResolveDns 查 DNS）搭配 -Ping / -TcpPort 才能判定</w:t>
             </w:r>
           </w:p>
         </w:tc>
@@ -4604,7 +4656,7 @@
                 <w:sz w:val="19"/>
                 <w:szCs w:val="19"/>
               </w:rPr>
-              <w:t xml:space="preserve">額外以 ICMP 判定；IP 取自 Tools 回報的第一個 IPv4</w:t>
+              <w:t xml:space="preserve">額外以 ICMP 判定</w:t>
             </w:r>
           </w:p>
         </w:tc>
@@ -4631,7 +4683,7 @@
                 <w:sz w:val="19"/>
                 <w:szCs w:val="19"/>
               </w:rPr>
-              <w:t xml:space="preserve">-PingMap</w:t>
+              <w:t xml:space="preserve">-TcpPort</w:t>
             </w:r>
           </w:p>
         </w:tc>
@@ -4656,7 +4708,7 @@
                 <w:sz w:val="19"/>
                 <w:szCs w:val="19"/>
               </w:rPr>
-              <w:t xml:space="preserve">hashtable</w:t>
+              <w:t xml:space="preserve">整數陣列</w:t>
             </w:r>
           </w:p>
         </w:tc>
@@ -4681,7 +4733,7 @@
                 <w:sz w:val="19"/>
                 <w:szCs w:val="19"/>
               </w:rPr>
-              <w:t xml:space="preserve">VM 名稱 → IP 對照，供沒裝 Tools 或多網卡的 VM 指定 ping 目標</w:t>
+              <w:t xml:space="preserve">額外以 TCP 連線判定，任一 port 連得上即可達，例如 22,3389,443；不受 guest 防火牆擋 ICMP 影響</w:t>
             </w:r>
           </w:p>
         </w:tc>
@@ -4707,7 +4759,7 @@
                 <w:sz w:val="19"/>
                 <w:szCs w:val="19"/>
               </w:rPr>
-              <w:t xml:space="preserve">-PowerOnIfOff</w:t>
+              <w:t xml:space="preserve">-PingMap</w:t>
             </w:r>
           </w:p>
         </w:tc>
@@ -4731,7 +4783,7 @@
                 <w:sz w:val="19"/>
                 <w:szCs w:val="19"/>
               </w:rPr>
-              <w:t xml:space="preserve">switch</w:t>
+              <w:t xml:space="preserve">hashtable</w:t>
             </w:r>
           </w:p>
         </w:tc>
@@ -4755,7 +4807,7 @@
                 <w:sz w:val="19"/>
                 <w:szCs w:val="19"/>
               </w:rPr>
-              <w:t xml:space="preserve">poweredOff 也視為異常並開機（預設關閉）</w:t>
+              <w:t xml:space="preserve">VM 名稱 → IP 對照，供沒裝 Tools 或多網卡的 VM 指定目標</w:t>
             </w:r>
           </w:p>
         </w:tc>
@@ -4782,7 +4834,7 @@
                 <w:sz w:val="19"/>
                 <w:szCs w:val="19"/>
               </w:rPr>
-              <w:t xml:space="preserve">-Loop / -IntervalSeconds</w:t>
+              <w:t xml:space="preserve">-ResolveDns</w:t>
             </w:r>
           </w:p>
         </w:tc>
@@ -4807,7 +4859,7 @@
                 <w:sz w:val="19"/>
                 <w:szCs w:val="19"/>
               </w:rPr>
-              <w:t xml:space="preserve">switch / 整數，60</w:t>
+              <w:t xml:space="preserve">switch</w:t>
             </w:r>
           </w:p>
         </w:tc>
@@ -4832,7 +4884,7 @@
                 <w:sz w:val="19"/>
                 <w:szCs w:val="19"/>
               </w:rPr>
-              <w:t xml:space="preserve">常駐模式與檢查間隔；不加 -Loop 則跑一次就結束</w:t>
+              <w:t xml:space="preserve">沒 Tools 也不在 PingMap 的 VM，以 VM 名稱查 DNS 取得 IP</w:t>
             </w:r>
           </w:p>
         </w:tc>
@@ -4858,7 +4910,7 @@
                 <w:sz w:val="19"/>
                 <w:szCs w:val="19"/>
               </w:rPr>
-              <w:t xml:space="preserve">-DryRun</w:t>
+              <w:t xml:space="preserve">-DnsSuffix</w:t>
             </w:r>
           </w:p>
         </w:tc>
@@ -4882,7 +4934,7 @@
                 <w:sz w:val="19"/>
                 <w:szCs w:val="19"/>
               </w:rPr>
-              <w:t xml:space="preserve">switch</w:t>
+              <w:t xml:space="preserve">字串</w:t>
             </w:r>
           </w:p>
         </w:tc>
@@ -4906,7 +4958,7 @@
                 <w:sz w:val="19"/>
                 <w:szCs w:val="19"/>
               </w:rPr>
-              <w:t xml:space="preserve">只記錄不執行</w:t>
+              <w:t xml:space="preserve">-ResolveDns 時附加的網域，例如 example.com</w:t>
             </w:r>
           </w:p>
         </w:tc>
@@ -4933,7 +4985,7 @@
                 <w:sz w:val="19"/>
                 <w:szCs w:val="19"/>
               </w:rPr>
-              <w:t xml:space="preserve">-LogPath / -StatePath</w:t>
+              <w:t xml:space="preserve">-PowerOnIfOff</w:t>
             </w:r>
           </w:p>
         </w:tc>
@@ -4958,7 +5010,7 @@
                 <w:sz w:val="19"/>
                 <w:szCs w:val="19"/>
               </w:rPr>
-              <w:t xml:space="preserve">字串</w:t>
+              <w:t xml:space="preserve">switch</w:t>
             </w:r>
           </w:p>
         </w:tc>
@@ -4966,6 +5018,231 @@
           <w:tcPr>
             <w:tcW w:type="dxa" w:w="4959"/>
             <w:shd w:fill="F5F7FA" w:val="clear"/>
+            <w:tcMar>
+              <w:top w:type="dxa" w:w="60"/>
+              <w:left w:type="dxa" w:w="90"/>
+              <w:bottom w:type="dxa" w:w="60"/>
+              <w:right w:type="dxa" w:w="90"/>
+            </w:tcMar>
+          </w:tcPr>
+          <w:p>
+            <w:pPr>
+              <w:spacing w:after="0"/>
+            </w:pPr>
+            <w:r>
+              <w:rPr>
+                <w:rFonts w:ascii="Microsoft JhengHei" w:cs="Microsoft JhengHei" w:eastAsia="Microsoft JhengHei" w:hAnsi="Microsoft JhengHei"/>
+                <w:sz w:val="19"/>
+                <w:szCs w:val="19"/>
+              </w:rPr>
+              <w:t xml:space="preserve">poweredOff 也視為異常並開機（預設關閉）</w:t>
+            </w:r>
+          </w:p>
+        </w:tc>
+      </w:tr>
+      <w:tr>
+        <w:tc>
+          <w:tcPr>
+            <w:tcW w:type="dxa" w:w="2433"/>
+            <w:tcMar>
+              <w:top w:type="dxa" w:w="60"/>
+              <w:left w:type="dxa" w:w="90"/>
+              <w:bottom w:type="dxa" w:w="60"/>
+              <w:right w:type="dxa" w:w="90"/>
+            </w:tcMar>
+          </w:tcPr>
+          <w:p>
+            <w:pPr>
+              <w:spacing w:after="0"/>
+            </w:pPr>
+            <w:r>
+              <w:rPr>
+                <w:rFonts w:ascii="Microsoft JhengHei" w:cs="Microsoft JhengHei" w:eastAsia="Microsoft JhengHei" w:hAnsi="Microsoft JhengHei"/>
+                <w:sz w:val="19"/>
+                <w:szCs w:val="19"/>
+              </w:rPr>
+              <w:t xml:space="preserve">-Loop / -IntervalSeconds</w:t>
+            </w:r>
+          </w:p>
+        </w:tc>
+        <w:tc>
+          <w:tcPr>
+            <w:tcW w:type="dxa" w:w="2246"/>
+            <w:tcMar>
+              <w:top w:type="dxa" w:w="60"/>
+              <w:left w:type="dxa" w:w="90"/>
+              <w:bottom w:type="dxa" w:w="60"/>
+              <w:right w:type="dxa" w:w="90"/>
+            </w:tcMar>
+          </w:tcPr>
+          <w:p>
+            <w:pPr>
+              <w:spacing w:after="0"/>
+            </w:pPr>
+            <w:r>
+              <w:rPr>
+                <w:rFonts w:ascii="Microsoft JhengHei" w:cs="Microsoft JhengHei" w:eastAsia="Microsoft JhengHei" w:hAnsi="Microsoft JhengHei"/>
+                <w:sz w:val="19"/>
+                <w:szCs w:val="19"/>
+              </w:rPr>
+              <w:t xml:space="preserve">switch / 整數，60</w:t>
+            </w:r>
+          </w:p>
+        </w:tc>
+        <w:tc>
+          <w:tcPr>
+            <w:tcW w:type="dxa" w:w="4959"/>
+            <w:tcMar>
+              <w:top w:type="dxa" w:w="60"/>
+              <w:left w:type="dxa" w:w="90"/>
+              <w:bottom w:type="dxa" w:w="60"/>
+              <w:right w:type="dxa" w:w="90"/>
+            </w:tcMar>
+          </w:tcPr>
+          <w:p>
+            <w:pPr>
+              <w:spacing w:after="0"/>
+            </w:pPr>
+            <w:r>
+              <w:rPr>
+                <w:rFonts w:ascii="Microsoft JhengHei" w:cs="Microsoft JhengHei" w:eastAsia="Microsoft JhengHei" w:hAnsi="Microsoft JhengHei"/>
+                <w:sz w:val="19"/>
+                <w:szCs w:val="19"/>
+              </w:rPr>
+              <w:t xml:space="preserve">常駐模式與檢查間隔；不加 -Loop 則跑一次就結束</w:t>
+            </w:r>
+          </w:p>
+        </w:tc>
+      </w:tr>
+      <w:tr>
+        <w:tc>
+          <w:tcPr>
+            <w:tcW w:type="dxa" w:w="2433"/>
+            <w:shd w:fill="F5F7FA" w:val="clear"/>
+            <w:tcMar>
+              <w:top w:type="dxa" w:w="60"/>
+              <w:left w:type="dxa" w:w="90"/>
+              <w:bottom w:type="dxa" w:w="60"/>
+              <w:right w:type="dxa" w:w="90"/>
+            </w:tcMar>
+          </w:tcPr>
+          <w:p>
+            <w:pPr>
+              <w:spacing w:after="0"/>
+            </w:pPr>
+            <w:r>
+              <w:rPr>
+                <w:rFonts w:ascii="Microsoft JhengHei" w:cs="Microsoft JhengHei" w:eastAsia="Microsoft JhengHei" w:hAnsi="Microsoft JhengHei"/>
+                <w:sz w:val="19"/>
+                <w:szCs w:val="19"/>
+              </w:rPr>
+              <w:t xml:space="preserve">-DryRun</w:t>
+            </w:r>
+          </w:p>
+        </w:tc>
+        <w:tc>
+          <w:tcPr>
+            <w:tcW w:type="dxa" w:w="2246"/>
+            <w:shd w:fill="F5F7FA" w:val="clear"/>
+            <w:tcMar>
+              <w:top w:type="dxa" w:w="60"/>
+              <w:left w:type="dxa" w:w="90"/>
+              <w:bottom w:type="dxa" w:w="60"/>
+              <w:right w:type="dxa" w:w="90"/>
+            </w:tcMar>
+          </w:tcPr>
+          <w:p>
+            <w:pPr>
+              <w:spacing w:after="0"/>
+            </w:pPr>
+            <w:r>
+              <w:rPr>
+                <w:rFonts w:ascii="Microsoft JhengHei" w:cs="Microsoft JhengHei" w:eastAsia="Microsoft JhengHei" w:hAnsi="Microsoft JhengHei"/>
+                <w:sz w:val="19"/>
+                <w:szCs w:val="19"/>
+              </w:rPr>
+              <w:t xml:space="preserve">switch</w:t>
+            </w:r>
+          </w:p>
+        </w:tc>
+        <w:tc>
+          <w:tcPr>
+            <w:tcW w:type="dxa" w:w="4959"/>
+            <w:shd w:fill="F5F7FA" w:val="clear"/>
+            <w:tcMar>
+              <w:top w:type="dxa" w:w="60"/>
+              <w:left w:type="dxa" w:w="90"/>
+              <w:bottom w:type="dxa" w:w="60"/>
+              <w:right w:type="dxa" w:w="90"/>
+            </w:tcMar>
+          </w:tcPr>
+          <w:p>
+            <w:pPr>
+              <w:spacing w:after="0"/>
+            </w:pPr>
+            <w:r>
+              <w:rPr>
+                <w:rFonts w:ascii="Microsoft JhengHei" w:cs="Microsoft JhengHei" w:eastAsia="Microsoft JhengHei" w:hAnsi="Microsoft JhengHei"/>
+                <w:sz w:val="19"/>
+                <w:szCs w:val="19"/>
+              </w:rPr>
+              <w:t xml:space="preserve">只記錄不執行</w:t>
+            </w:r>
+          </w:p>
+        </w:tc>
+      </w:tr>
+      <w:tr>
+        <w:tc>
+          <w:tcPr>
+            <w:tcW w:type="dxa" w:w="2433"/>
+            <w:tcMar>
+              <w:top w:type="dxa" w:w="60"/>
+              <w:left w:type="dxa" w:w="90"/>
+              <w:bottom w:type="dxa" w:w="60"/>
+              <w:right w:type="dxa" w:w="90"/>
+            </w:tcMar>
+          </w:tcPr>
+          <w:p>
+            <w:pPr>
+              <w:spacing w:after="0"/>
+            </w:pPr>
+            <w:r>
+              <w:rPr>
+                <w:rFonts w:ascii="Microsoft JhengHei" w:cs="Microsoft JhengHei" w:eastAsia="Microsoft JhengHei" w:hAnsi="Microsoft JhengHei"/>
+                <w:sz w:val="19"/>
+                <w:szCs w:val="19"/>
+              </w:rPr>
+              <w:t xml:space="preserve">-LogPath / -StatePath</w:t>
+            </w:r>
+          </w:p>
+        </w:tc>
+        <w:tc>
+          <w:tcPr>
+            <w:tcW w:type="dxa" w:w="2246"/>
+            <w:tcMar>
+              <w:top w:type="dxa" w:w="60"/>
+              <w:left w:type="dxa" w:w="90"/>
+              <w:bottom w:type="dxa" w:w="60"/>
+              <w:right w:type="dxa" w:w="90"/>
+            </w:tcMar>
+          </w:tcPr>
+          <w:p>
+            <w:pPr>
+              <w:spacing w:after="0"/>
+            </w:pPr>
+            <w:r>
+              <w:rPr>
+                <w:rFonts w:ascii="Microsoft JhengHei" w:cs="Microsoft JhengHei" w:eastAsia="Microsoft JhengHei" w:hAnsi="Microsoft JhengHei"/>
+                <w:sz w:val="19"/>
+                <w:szCs w:val="19"/>
+              </w:rPr>
+              <w:t xml:space="preserve">字串</w:t>
+            </w:r>
+          </w:p>
+        </w:tc>
+        <w:tc>
+          <w:tcPr>
+            <w:tcW w:type="dxa" w:w="4959"/>
             <w:tcMar>
               <w:top w:type="dxa" w:w="60"/>
               <w:left w:type="dxa" w:w="90"/>
@@ -5464,6 +5741,353 @@
     </w:p>
     <w:p>
       <w:pPr>
+        <w:spacing w:after="120"/>
+      </w:pPr>
+      <w:r>
+        <w:rPr>
+          <w:rFonts w:ascii="Microsoft JhengHei" w:cs="Microsoft JhengHei" w:eastAsia="Microsoft JhengHei" w:hAnsi="Microsoft JhengHei"/>
+          <w:sz w:val="20"/>
+          <w:szCs w:val="20"/>
+        </w:rPr>
+        <w:t xml:space="preserve">沒有 VMware Tools 時，vCenter 拿不到 guest 任何資訊（Tools 狀態、heartbeat、IP 都是空的），腳本預設略過、不動手。要納管這類 VM，必須從外部給它一個「可達性」判定：</w:t>
+      </w:r>
+    </w:p>
+    <w:tbl>
+      <w:tblPr>
+        <w:tblW w:type="dxa" w:w="9638"/>
+        <w:tblBorders>
+          <w:top w:val="single" w:color="auto" w:sz="4"/>
+          <w:left w:val="single" w:color="auto" w:sz="4"/>
+          <w:bottom w:val="single" w:color="auto" w:sz="4"/>
+          <w:right w:val="single" w:color="auto" w:sz="4"/>
+          <w:insideH w:val="single" w:color="auto" w:sz="4"/>
+          <w:insideV w:val="single" w:color="auto" w:sz="4"/>
+        </w:tblBorders>
+      </w:tblPr>
+      <w:tblGrid>
+        <w:gridCol w:w="2807"/>
+        <w:gridCol w:w="4304"/>
+        <w:gridCol w:w="2526"/>
+      </w:tblGrid>
+      <w:tr>
+        <w:trPr>
+          <w:tblHeader/>
+        </w:trPr>
+        <w:tc>
+          <w:tcPr>
+            <w:tcW w:type="dxa" w:w="2807"/>
+            <w:shd w:fill="1F3864" w:val="clear"/>
+            <w:tcMar>
+              <w:top w:type="dxa" w:w="60"/>
+              <w:left w:type="dxa" w:w="90"/>
+              <w:bottom w:type="dxa" w:w="60"/>
+              <w:right w:type="dxa" w:w="90"/>
+            </w:tcMar>
+          </w:tcPr>
+          <w:p>
+            <w:pPr>
+              <w:spacing w:after="0"/>
+            </w:pPr>
+            <w:r>
+              <w:rPr>
+                <w:rFonts w:ascii="Microsoft JhengHei" w:cs="Microsoft JhengHei" w:eastAsia="Microsoft JhengHei" w:hAnsi="Microsoft JhengHei"/>
+                <w:b/>
+                <w:bCs/>
+                <w:color w:val="FFFFFF"/>
+                <w:sz w:val="19"/>
+                <w:szCs w:val="19"/>
+              </w:rPr>
+              <w:t xml:space="preserve">方式</w:t>
+            </w:r>
+          </w:p>
+        </w:tc>
+        <w:tc>
+          <w:tcPr>
+            <w:tcW w:type="dxa" w:w="4304"/>
+            <w:shd w:fill="1F3864" w:val="clear"/>
+            <w:tcMar>
+              <w:top w:type="dxa" w:w="60"/>
+              <w:left w:type="dxa" w:w="90"/>
+              <w:bottom w:type="dxa" w:w="60"/>
+              <w:right w:type="dxa" w:w="90"/>
+            </w:tcMar>
+          </w:tcPr>
+          <w:p>
+            <w:pPr>
+              <w:spacing w:after="0"/>
+            </w:pPr>
+            <w:r>
+              <w:rPr>
+                <w:rFonts w:ascii="Microsoft JhengHei" w:cs="Microsoft JhengHei" w:eastAsia="Microsoft JhengHei" w:hAnsi="Microsoft JhengHei"/>
+                <w:b/>
+                <w:bCs/>
+                <w:color w:val="FFFFFF"/>
+                <w:sz w:val="19"/>
+                <w:szCs w:val="19"/>
+              </w:rPr>
+              <w:t xml:space="preserve">指令</w:t>
+            </w:r>
+          </w:p>
+        </w:tc>
+        <w:tc>
+          <w:tcPr>
+            <w:tcW w:type="dxa" w:w="2526"/>
+            <w:shd w:fill="1F3864" w:val="clear"/>
+            <w:tcMar>
+              <w:top w:type="dxa" w:w="60"/>
+              <w:left w:type="dxa" w:w="90"/>
+              <w:bottom w:type="dxa" w:w="60"/>
+              <w:right w:type="dxa" w:w="90"/>
+            </w:tcMar>
+          </w:tcPr>
+          <w:p>
+            <w:pPr>
+              <w:spacing w:after="0"/>
+            </w:pPr>
+            <w:r>
+              <w:rPr>
+                <w:rFonts w:ascii="Microsoft JhengHei" w:cs="Microsoft JhengHei" w:eastAsia="Microsoft JhengHei" w:hAnsi="Microsoft JhengHei"/>
+                <w:b/>
+                <w:bCs/>
+                <w:color w:val="FFFFFF"/>
+                <w:sz w:val="19"/>
+                <w:szCs w:val="19"/>
+              </w:rPr>
+              <w:t xml:space="preserve">適用</w:t>
+            </w:r>
+          </w:p>
+        </w:tc>
+      </w:tr>
+      <w:tr>
+        <w:tc>
+          <w:tcPr>
+            <w:tcW w:type="dxa" w:w="2807"/>
+            <w:tcMar>
+              <w:top w:type="dxa" w:w="60"/>
+              <w:left w:type="dxa" w:w="90"/>
+              <w:bottom w:type="dxa" w:w="60"/>
+              <w:right w:type="dxa" w:w="90"/>
+            </w:tcMar>
+          </w:tcPr>
+          <w:p>
+            <w:pPr>
+              <w:spacing w:after="0"/>
+            </w:pPr>
+            <w:r>
+              <w:rPr>
+                <w:rFonts w:ascii="Microsoft JhengHei" w:cs="Microsoft JhengHei" w:eastAsia="Microsoft JhengHei" w:hAnsi="Microsoft JhengHei"/>
+                <w:sz w:val="19"/>
+                <w:szCs w:val="19"/>
+              </w:rPr>
+              <w:t xml:space="preserve">指定 IP + ping</w:t>
+            </w:r>
+          </w:p>
+        </w:tc>
+        <w:tc>
+          <w:tcPr>
+            <w:tcW w:type="dxa" w:w="4304"/>
+            <w:tcMar>
+              <w:top w:type="dxa" w:w="60"/>
+              <w:left w:type="dxa" w:w="90"/>
+              <w:bottom w:type="dxa" w:w="60"/>
+              <w:right w:type="dxa" w:w="90"/>
+            </w:tcMar>
+          </w:tcPr>
+          <w:p>
+            <w:pPr>
+              <w:spacing w:after="0"/>
+            </w:pPr>
+            <w:r>
+              <w:rPr>
+                <w:rFonts w:ascii="Microsoft JhengHei" w:cs="Microsoft JhengHei" w:eastAsia="Microsoft JhengHei" w:hAnsi="Microsoft JhengHei"/>
+                <w:sz w:val="19"/>
+                <w:szCs w:val="19"/>
+              </w:rPr>
+              <w:t xml:space="preserve">-Ping -PingMap @{ legacy01 = '10.10.1.50' }</w:t>
+            </w:r>
+          </w:p>
+        </w:tc>
+        <w:tc>
+          <w:tcPr>
+            <w:tcW w:type="dxa" w:w="2526"/>
+            <w:tcMar>
+              <w:top w:type="dxa" w:w="60"/>
+              <w:left w:type="dxa" w:w="90"/>
+              <w:bottom w:type="dxa" w:w="60"/>
+              <w:right w:type="dxa" w:w="90"/>
+            </w:tcMar>
+          </w:tcPr>
+          <w:p>
+            <w:pPr>
+              <w:spacing w:after="0"/>
+            </w:pPr>
+            <w:r>
+              <w:rPr>
+                <w:rFonts w:ascii="Microsoft JhengHei" w:cs="Microsoft JhengHei" w:eastAsia="Microsoft JhengHei" w:hAnsi="Microsoft JhengHei"/>
+                <w:sz w:val="19"/>
+                <w:szCs w:val="19"/>
+              </w:rPr>
+              <w:t xml:space="preserve">VM 少、IP 固定</w:t>
+            </w:r>
+          </w:p>
+        </w:tc>
+      </w:tr>
+      <w:tr>
+        <w:tc>
+          <w:tcPr>
+            <w:tcW w:type="dxa" w:w="2807"/>
+            <w:tcMar>
+              <w:top w:type="dxa" w:w="60"/>
+              <w:left w:type="dxa" w:w="90"/>
+              <w:bottom w:type="dxa" w:w="60"/>
+              <w:right w:type="dxa" w:w="90"/>
+            </w:tcMar>
+          </w:tcPr>
+          <w:p>
+            <w:pPr>
+              <w:spacing w:after="0"/>
+            </w:pPr>
+            <w:r>
+              <w:rPr>
+                <w:rFonts w:ascii="Microsoft JhengHei" w:cs="Microsoft JhengHei" w:eastAsia="Microsoft JhengHei" w:hAnsi="Microsoft JhengHei"/>
+                <w:sz w:val="19"/>
+                <w:szCs w:val="19"/>
+              </w:rPr>
+              <w:t xml:space="preserve">DNS 查 IP + TCP port（建議）</w:t>
+            </w:r>
+          </w:p>
+        </w:tc>
+        <w:tc>
+          <w:tcPr>
+            <w:tcW w:type="dxa" w:w="4304"/>
+            <w:tcMar>
+              <w:top w:type="dxa" w:w="60"/>
+              <w:left w:type="dxa" w:w="90"/>
+              <w:bottom w:type="dxa" w:w="60"/>
+              <w:right w:type="dxa" w:w="90"/>
+            </w:tcMar>
+          </w:tcPr>
+          <w:p>
+            <w:pPr>
+              <w:spacing w:after="0"/>
+            </w:pPr>
+            <w:r>
+              <w:rPr>
+                <w:rFonts w:ascii="Microsoft JhengHei" w:cs="Microsoft JhengHei" w:eastAsia="Microsoft JhengHei" w:hAnsi="Microsoft JhengHei"/>
+                <w:sz w:val="19"/>
+                <w:szCs w:val="19"/>
+              </w:rPr>
+              <w:t xml:space="preserve">-ResolveDns -DnsSuffix example.com -TcpPort 22,3389</w:t>
+            </w:r>
+          </w:p>
+        </w:tc>
+        <w:tc>
+          <w:tcPr>
+            <w:tcW w:type="dxa" w:w="2526"/>
+            <w:tcMar>
+              <w:top w:type="dxa" w:w="60"/>
+              <w:left w:type="dxa" w:w="90"/>
+              <w:bottom w:type="dxa" w:w="60"/>
+              <w:right w:type="dxa" w:w="90"/>
+            </w:tcMar>
+          </w:tcPr>
+          <w:p>
+            <w:pPr>
+              <w:spacing w:after="0"/>
+            </w:pPr>
+            <w:r>
+              <w:rPr>
+                <w:rFonts w:ascii="Microsoft JhengHei" w:cs="Microsoft JhengHei" w:eastAsia="Microsoft JhengHei" w:hAnsi="Microsoft JhengHei"/>
+                <w:sz w:val="19"/>
+                <w:szCs w:val="19"/>
+              </w:rPr>
+              <w:t xml:space="preserve">VM 名稱 = 主機名；不必維護 IP 表，也不怕 ICMP 被擋</w:t>
+            </w:r>
+          </w:p>
+        </w:tc>
+      </w:tr>
+      <w:tr>
+        <w:tc>
+          <w:tcPr>
+            <w:tcW w:type="dxa" w:w="2807"/>
+            <w:tcMar>
+              <w:top w:type="dxa" w:w="60"/>
+              <w:left w:type="dxa" w:w="90"/>
+              <w:bottom w:type="dxa" w:w="60"/>
+              <w:right w:type="dxa" w:w="90"/>
+            </w:tcMar>
+          </w:tcPr>
+          <w:p>
+            <w:pPr>
+              <w:spacing w:after="0"/>
+            </w:pPr>
+            <w:r>
+              <w:rPr>
+                <w:rFonts w:ascii="Microsoft JhengHei" w:cs="Microsoft JhengHei" w:eastAsia="Microsoft JhengHei" w:hAnsi="Microsoft JhengHei"/>
+                <w:sz w:val="19"/>
+                <w:szCs w:val="19"/>
+              </w:rPr>
+              <w:t xml:space="preserve">DNS 查 IP + ping</w:t>
+            </w:r>
+          </w:p>
+        </w:tc>
+        <w:tc>
+          <w:tcPr>
+            <w:tcW w:type="dxa" w:w="4304"/>
+            <w:tcMar>
+              <w:top w:type="dxa" w:w="60"/>
+              <w:left w:type="dxa" w:w="90"/>
+              <w:bottom w:type="dxa" w:w="60"/>
+              <w:right w:type="dxa" w:w="90"/>
+            </w:tcMar>
+          </w:tcPr>
+          <w:p>
+            <w:pPr>
+              <w:spacing w:after="0"/>
+            </w:pPr>
+            <w:r>
+              <w:rPr>
+                <w:rFonts w:ascii="Microsoft JhengHei" w:cs="Microsoft JhengHei" w:eastAsia="Microsoft JhengHei" w:hAnsi="Microsoft JhengHei"/>
+                <w:sz w:val="19"/>
+                <w:szCs w:val="19"/>
+              </w:rPr>
+              <w:t xml:space="preserve">-ResolveDns -DnsSuffix example.com -Ping</w:t>
+            </w:r>
+          </w:p>
+        </w:tc>
+        <w:tc>
+          <w:tcPr>
+            <w:tcW w:type="dxa" w:w="2526"/>
+            <w:tcMar>
+              <w:top w:type="dxa" w:w="60"/>
+              <w:left w:type="dxa" w:w="90"/>
+              <w:bottom w:type="dxa" w:w="60"/>
+              <w:right w:type="dxa" w:w="90"/>
+            </w:tcMar>
+          </w:tcPr>
+          <w:p>
+            <w:pPr>
+              <w:spacing w:after="0"/>
+            </w:pPr>
+            <w:r>
+              <w:rPr>
+                <w:rFonts w:ascii="Microsoft JhengHei" w:cs="Microsoft JhengHei" w:eastAsia="Microsoft JhengHei" w:hAnsi="Microsoft JhengHei"/>
+                <w:sz w:val="19"/>
+                <w:szCs w:val="19"/>
+              </w:rPr>
+              <w:t xml:space="preserve">guest 有放行 ICMP</w:t>
+            </w:r>
+          </w:p>
+        </w:tc>
+      </w:tr>
+    </w:tbl>
+    <w:p>
+      <w:pPr>
+        <w:spacing w:after="120"/>
+      </w:pPr>
+    </w:p>
+    <w:p>
+      <w:pPr>
         <w:keepNext w:val="false"/>
         <w:pBdr>
           <w:bottom w:val="single" w:color="DDDDDD" w:sz="2" w:space="4"/>
@@ -5478,13 +6102,52 @@
           <w:sz w:val="17"/>
           <w:szCs w:val="17"/>
         </w:rPr>
-        <w:t xml:space="preserve">pwsh .\Watch-VMHealth.ps1 -Server vc01.example.com -Credential $cred -VmName legacy01 -Ping -PingMap @{ legacy01 = '10.10.1.50' }</w:t>
+        <w:t xml:space="preserve">pwsh .Watch-VMHealth.ps1 -Server vc01.example.com -Credential $cred -Tag AutoRestart -ResolveDns -DnsSuffix example.com -TcpPort 22,3389 -Loop</w:t>
       </w:r>
     </w:p>
     <w:p>
       <w:pPr>
         <w:spacing w:after="100"/>
       </w:pPr>
+    </w:p>
+    <w:p>
+      <w:pPr>
+        <w:spacing w:after="120"/>
+      </w:pPr>
+      <w:r>
+        <w:rPr>
+          <w:rFonts w:ascii="Microsoft JhengHei" w:cs="Microsoft JhengHei" w:eastAsia="Microsoft JhengHei" w:hAnsi="Microsoft JhengHei"/>
+          <w:sz w:val="20"/>
+          <w:szCs w:val="20"/>
+        </w:rPr>
+        <w:t xml:space="preserve">TCP port 判定比 ping 更貼近「服務真的活著」：port 有回應代表 guest 網路堆疊與該服務程序都在。沒 Tools 的 VM 一旦判定不健康，只能走 Restart-VM 硬重置（沒有 Tools 無法通知作業系統正常重開）。</w:t>
+      </w:r>
+    </w:p>
+    <w:p>
+      <w:pPr>
+        <w:shd w:fill="E8F4EA" w:val="clear"/>
+        <w:spacing w:after="140" w:before="60"/>
+        <w:ind w:left="120" w:right="120"/>
+      </w:pPr>
+      <w:r>
+        <w:rPr>
+          <w:rFonts w:ascii="Microsoft JhengHei" w:cs="Microsoft JhengHei" w:eastAsia="Microsoft JhengHei" w:hAnsi="Microsoft JhengHei"/>
+          <w:b/>
+          <w:bCs/>
+          <w:color w:val="1E6B2E"/>
+          <w:sz w:val="20"/>
+          <w:szCs w:val="20"/>
+        </w:rPr>
+        <w:t xml:space="preserve">建議　</w:t>
+      </w:r>
+      <w:r>
+        <w:rPr>
+          <w:rFonts w:ascii="Microsoft JhengHei" w:cs="Microsoft JhengHei" w:eastAsia="Microsoft JhengHei" w:hAnsi="Microsoft JhengHei"/>
+          <w:sz w:val="20"/>
+          <w:szCs w:val="20"/>
+        </w:rPr>
+        <w:t xml:space="preserve">最根本的做法仍是裝 open-vm-tools（Linux 各發行版套件庫皆有，apt / yum / tdnf install open-vm-tools 一行），裝了以後 Tools 判定、IP 回報、正常重開都會有。</w:t>
+      </w:r>
     </w:p>
     <w:p>
       <w:pPr>
@@ -7248,7 +7911,82 @@
           <w:sz w:val="26"/>
           <w:szCs w:val="26"/>
         </w:rPr>
-        <w:t xml:space="preserve">7.4 實測抓到並修正的問題</w:t>
+        <w:t xml:space="preserve">7.4 沒裝 Tools 的 VM：DNS + TCP port 判定</w:t>
+      </w:r>
+    </w:p>
+    <w:p>
+      <w:pPr>
+        <w:spacing w:after="120"/>
+      </w:pPr>
+      <w:r>
+        <w:rPr>
+          <w:rFonts w:ascii="Microsoft JhengHei" w:cs="Microsoft JhengHei" w:eastAsia="Microsoft JhengHei" w:hAnsi="Microsoft JhengHei"/>
+          <w:sz w:val="20"/>
+          <w:szCs w:val="20"/>
+        </w:rPr>
+        <w:t xml:space="preserve">把 svc-test01 的 open-vm-tools 移除並重開後，vCenter 回報 ToolsRunningStatus = guestToolsNotRunning、IP 空白、heartbeat gray。以 -ResolveDns -DnsSuffix home.lab -TcpPort 22 監看：</w:t>
+      </w:r>
+    </w:p>
+    <w:p>
+      <w:pPr>
+        <w:keepNext/>
+        <w:spacing w:after="60" w:before="120"/>
+        <w:jc w:val="center"/>
+      </w:pPr>
+      <w:r>
+        <w:drawing>
+          <wp:inline distT="0" distB="0" distL="0" distR="0">
+            <wp:extent cx="6381750" cy="2047875"/>
+            <wp:effectExtent t="0" r="0" b="0" l="0"/>
+            <wp:docPr id="1" name="" descr="" title=""/>
+            <wp:cNvGraphicFramePr>
+              <a:graphicFrameLocks xmlns:a="http://schemas.openxmlformats.org/drawingml/2006/main" noChangeAspect="1"/>
+            </wp:cNvGraphicFramePr>
+            <a:graphic xmlns:a="http://schemas.openxmlformats.org/drawingml/2006/main">
+              <a:graphicData uri="http://schemas.openxmlformats.org/drawingml/2006/picture">
+                <pic:pic xmlns:pic="http://schemas.openxmlformats.org/drawingml/2006/picture">
+                  <pic:nvPicPr>
+                    <pic:cNvPr id="0" name="" descr=""/>
+                    <pic:cNvPicPr>
+                      <a:picLocks noChangeAspect="1" noChangeArrowheads="1"/>
+                    </pic:cNvPicPr>
+                  </pic:nvPicPr>
+                  <pic:blipFill>
+                    <a:blip r:embed="rId14" cstate="none"/>
+                    <a:srcRect/>
+                    <a:stretch>
+                      <a:fillRect/>
+                    </a:stretch>
+                  </pic:blipFill>
+                  <pic:spPr bwMode="auto">
+                    <a:xfrm>
+                      <a:off x="0" y="0"/>
+                      <a:ext cx="6381750" cy="2047875"/>
+                    </a:xfrm>
+                    <a:prstGeom prst="rect">
+                      <a:avLst/>
+                    </a:prstGeom>
+                  </pic:spPr>
+                </pic:pic>
+              </a:graphicData>
+            </a:graphic>
+          </wp:inline>
+        </w:drawing>
+      </w:r>
+    </w:p>
+    <w:p>
+      <w:pPr>
+        <w:spacing w:after="200"/>
+        <w:jc w:val="center"/>
+      </w:pPr>
+      <w:r>
+        <w:rPr>
+          <w:rFonts w:ascii="Microsoft JhengHei" w:cs="Microsoft JhengHei" w:eastAsia="Microsoft JhengHei" w:hAnsi="Microsoft JhengHei"/>
+          <w:color w:val="555555"/>
+          <w:sz w:val="18"/>
+          <w:szCs w:val="18"/>
+        </w:rPr>
+        <w:t xml:space="preserve">圖 6　無 Tools 的 VM：SSH port 22 可達視為健康；kernel panic 後 port 不通 3 次 → 硬重置 → 寬限 → 恢復</w:t>
       </w:r>
     </w:p>
     <w:tbl>
@@ -7296,7 +8034,7 @@
                 <w:sz w:val="19"/>
                 <w:szCs w:val="19"/>
               </w:rPr>
-              <w:t xml:space="preserve">問題</w:t>
+              <w:t xml:space="preserve">時間</w:t>
             </w:r>
           </w:p>
         </w:tc>
@@ -7324,7 +8062,7 @@
                 <w:sz w:val="19"/>
                 <w:szCs w:val="19"/>
               </w:rPr>
-              <w:t xml:space="preserve">現象</w:t>
+              <w:t xml:space="preserve">事件</w:t>
             </w:r>
           </w:p>
         </w:tc>
@@ -7352,7 +8090,7 @@
                 <w:sz w:val="19"/>
                 <w:szCs w:val="19"/>
               </w:rPr>
-              <w:t xml:space="preserve">處理</w:t>
+              <w:t xml:space="preserve">說明</w:t>
             </w:r>
           </w:p>
         </w:tc>
@@ -7378,7 +8116,7 @@
                 <w:sz w:val="19"/>
                 <w:szCs w:val="19"/>
               </w:rPr>
-              <w:t xml:space="preserve">硬重置不更新 BootTime</w:t>
+              <w:t xml:space="preserve">08:51:48</w:t>
             </w:r>
           </w:p>
         </w:tc>
@@ -7402,7 +8140,7 @@
                 <w:sz w:val="19"/>
                 <w:szCs w:val="19"/>
               </w:rPr>
-              <w:t xml:space="preserve">第一輪重置後 20 秒腳本又判定不健康（靠冷卻機制才擋住）</w:t>
+              <w:t xml:space="preserve">正常 1</w:t>
             </w:r>
           </w:p>
         </w:tc>
@@ -7426,7 +8164,7 @@
                 <w:sz w:val="19"/>
                 <w:szCs w:val="19"/>
               </w:rPr>
-              <w:t xml:space="preserve">寬限期改以 BootTime 與腳本自己的上次重開時間較晚者起算，第二輪驗證正確</w:t>
+              <w:t xml:space="preserve">Tools 未執行，但 DNS 解到 10.0.0.8、TCP 22 可達 → 判定健康</w:t>
             </w:r>
           </w:p>
         </w:tc>
@@ -7435,72 +8173,75 @@
         <w:tc>
           <w:tcPr>
             <w:tcW w:type="dxa" w:w="2433"/>
-            <w:tcMar>
-              <w:top w:type="dxa" w:w="60"/>
-              <w:left w:type="dxa" w:w="90"/>
-              <w:bottom w:type="dxa" w:w="60"/>
-              <w:right w:type="dxa" w:w="90"/>
-            </w:tcMar>
-          </w:tcPr>
-          <w:p>
-            <w:pPr>
-              <w:spacing w:after="0"/>
-            </w:pPr>
-            <w:r>
-              <w:rPr>
-                <w:rFonts w:ascii="Microsoft JhengHei" w:cs="Microsoft JhengHei" w:eastAsia="Microsoft JhengHei" w:hAnsi="Microsoft JhengHei"/>
-                <w:sz w:val="19"/>
-                <w:szCs w:val="19"/>
-              </w:rPr>
-              <w:t xml:space="preserve">Guest 防火牆擋 ICMP</w:t>
+            <w:shd w:fill="F5F7FA" w:val="clear"/>
+            <w:tcMar>
+              <w:top w:type="dxa" w:w="60"/>
+              <w:left w:type="dxa" w:w="90"/>
+              <w:bottom w:type="dxa" w:w="60"/>
+              <w:right w:type="dxa" w:w="90"/>
+            </w:tcMar>
+          </w:tcPr>
+          <w:p>
+            <w:pPr>
+              <w:spacing w:after="0"/>
+            </w:pPr>
+            <w:r>
+              <w:rPr>
+                <w:rFonts w:ascii="Microsoft JhengHei" w:cs="Microsoft JhengHei" w:eastAsia="Microsoft JhengHei" w:hAnsi="Microsoft JhengHei"/>
+                <w:sz w:val="19"/>
+                <w:szCs w:val="19"/>
+              </w:rPr>
+              <w:t xml:space="preserve">約 08:51:56</w:t>
             </w:r>
           </w:p>
         </w:tc>
         <w:tc>
           <w:tcPr>
             <w:tcW w:type="dxa" w:w="3743"/>
-            <w:tcMar>
-              <w:top w:type="dxa" w:w="60"/>
-              <w:left w:type="dxa" w:w="90"/>
-              <w:bottom w:type="dxa" w:w="60"/>
-              <w:right w:type="dxa" w:w="90"/>
-            </w:tcMar>
-          </w:tcPr>
-          <w:p>
-            <w:pPr>
-              <w:spacing w:after="0"/>
-            </w:pPr>
-            <w:r>
-              <w:rPr>
-                <w:rFonts w:ascii="Microsoft JhengHei" w:cs="Microsoft JhengHei" w:eastAsia="Microsoft JhengHei" w:hAnsi="Microsoft JhengHei"/>
-                <w:sz w:val="19"/>
-                <w:szCs w:val="19"/>
-              </w:rPr>
-              <w:t xml:space="preserve">Photon OS 預設 iptables INPUT DROP，-Ping 誤判為不通，觸發一次正常重開（Restart-VMGuest）</w:t>
+            <w:shd w:fill="F5F7FA" w:val="clear"/>
+            <w:tcMar>
+              <w:top w:type="dxa" w:w="60"/>
+              <w:left w:type="dxa" w:w="90"/>
+              <w:bottom w:type="dxa" w:w="60"/>
+              <w:right w:type="dxa" w:w="90"/>
+            </w:tcMar>
+          </w:tcPr>
+          <w:p>
+            <w:pPr>
+              <w:spacing w:after="0"/>
+            </w:pPr>
+            <w:r>
+              <w:rPr>
+                <w:rFonts w:ascii="Microsoft JhengHei" w:cs="Microsoft JhengHei" w:eastAsia="Microsoft JhengHei" w:hAnsi="Microsoft JhengHei"/>
+                <w:sz w:val="19"/>
+                <w:szCs w:val="19"/>
+              </w:rPr>
+              <w:t xml:space="preserve">guest kernel panic</w:t>
             </w:r>
           </w:p>
         </w:tc>
         <w:tc>
           <w:tcPr>
             <w:tcW w:type="dxa" w:w="3462"/>
-            <w:tcMar>
-              <w:top w:type="dxa" w:w="60"/>
-              <w:left w:type="dxa" w:w="90"/>
-              <w:bottom w:type="dxa" w:w="60"/>
-              <w:right w:type="dxa" w:w="90"/>
-            </w:tcMar>
-          </w:tcPr>
-          <w:p>
-            <w:pPr>
-              <w:spacing w:after="0"/>
-            </w:pPr>
-            <w:r>
-              <w:rPr>
-                <w:rFonts w:ascii="Microsoft JhengHei" w:cs="Microsoft JhengHei" w:eastAsia="Microsoft JhengHei" w:hAnsi="Microsoft JhengHei"/>
-                <w:sz w:val="19"/>
-                <w:szCs w:val="19"/>
-              </w:rPr>
-              <w:t xml:space="preserve">屬 guest 設定問題；使用 -Ping 前須確認目標 VM 放行 ICMP，或改用 Tools 判定</w:t>
+            <w:shd w:fill="F5F7FA" w:val="clear"/>
+            <w:tcMar>
+              <w:top w:type="dxa" w:w="60"/>
+              <w:left w:type="dxa" w:w="90"/>
+              <w:bottom w:type="dxa" w:w="60"/>
+              <w:right w:type="dxa" w:w="90"/>
+            </w:tcMar>
+          </w:tcPr>
+          <w:p>
+            <w:pPr>
+              <w:spacing w:after="0"/>
+            </w:pPr>
+            <w:r>
+              <w:rPr>
+                <w:rFonts w:ascii="Microsoft JhengHei" w:cs="Microsoft JhengHei" w:eastAsia="Microsoft JhengHei" w:hAnsi="Microsoft JhengHei"/>
+                <w:sz w:val="19"/>
+                <w:szCs w:val="19"/>
+              </w:rPr>
+              <w:t xml:space="preserve">故障注入（SSH 觸發 sysrq）</w:t>
             </w:r>
           </w:p>
         </w:tc>
@@ -7526,6 +8267,543 @@
                 <w:sz w:val="19"/>
                 <w:szCs w:val="19"/>
               </w:rPr>
+              <w:t xml:space="preserve">08:52:11 ~ 08:52:56</w:t>
+            </w:r>
+          </w:p>
+        </w:tc>
+        <w:tc>
+          <w:tcPr>
+            <w:tcW w:type="dxa" w:w="3743"/>
+            <w:tcMar>
+              <w:top w:type="dxa" w:w="60"/>
+              <w:left w:type="dxa" w:w="90"/>
+              <w:bottom w:type="dxa" w:w="60"/>
+              <w:right w:type="dxa" w:w="90"/>
+            </w:tcMar>
+          </w:tcPr>
+          <w:p>
+            <w:pPr>
+              <w:spacing w:after="0"/>
+            </w:pPr>
+            <w:r>
+              <w:rPr>
+                <w:rFonts w:ascii="Microsoft JhengHei" w:cs="Microsoft JhengHei" w:eastAsia="Microsoft JhengHei" w:hAnsi="Microsoft JhengHei"/>
+                <w:sz w:val="19"/>
+                <w:szCs w:val="19"/>
+              </w:rPr>
+              <w:t xml:space="preserve">不健康 (1/3 → 3/3)：Tools 未執行；10.0.0.8 tcp 22 不通</w:t>
+            </w:r>
+          </w:p>
+        </w:tc>
+        <w:tc>
+          <w:tcPr>
+            <w:tcW w:type="dxa" w:w="3462"/>
+            <w:tcMar>
+              <w:top w:type="dxa" w:w="60"/>
+              <w:left w:type="dxa" w:w="90"/>
+              <w:bottom w:type="dxa" w:w="60"/>
+              <w:right w:type="dxa" w:w="90"/>
+            </w:tcMar>
+          </w:tcPr>
+          <w:p>
+            <w:pPr>
+              <w:spacing w:after="0"/>
+            </w:pPr>
+            <w:r>
+              <w:rPr>
+                <w:rFonts w:ascii="Microsoft JhengHei" w:cs="Microsoft JhengHei" w:eastAsia="Microsoft JhengHei" w:hAnsi="Microsoft JhengHei"/>
+                <w:sz w:val="19"/>
+                <w:szCs w:val="19"/>
+              </w:rPr>
+              <w:t xml:space="preserve">達門檻 → Restart-VM 硬重置</w:t>
+            </w:r>
+          </w:p>
+        </w:tc>
+      </w:tr>
+      <w:tr>
+        <w:tc>
+          <w:tcPr>
+            <w:tcW w:type="dxa" w:w="2433"/>
+            <w:shd w:fill="F5F7FA" w:val="clear"/>
+            <w:tcMar>
+              <w:top w:type="dxa" w:w="60"/>
+              <w:left w:type="dxa" w:w="90"/>
+              <w:bottom w:type="dxa" w:w="60"/>
+              <w:right w:type="dxa" w:w="90"/>
+            </w:tcMar>
+          </w:tcPr>
+          <w:p>
+            <w:pPr>
+              <w:spacing w:after="0"/>
+            </w:pPr>
+            <w:r>
+              <w:rPr>
+                <w:rFonts w:ascii="Microsoft JhengHei" w:cs="Microsoft JhengHei" w:eastAsia="Microsoft JhengHei" w:hAnsi="Microsoft JhengHei"/>
+                <w:sz w:val="19"/>
+                <w:szCs w:val="19"/>
+              </w:rPr>
+              <w:t xml:space="preserve">08:53:18 ~ 08:55:40</w:t>
+            </w:r>
+          </w:p>
+        </w:tc>
+        <w:tc>
+          <w:tcPr>
+            <w:tcW w:type="dxa" w:w="3743"/>
+            <w:shd w:fill="F5F7FA" w:val="clear"/>
+            <w:tcMar>
+              <w:top w:type="dxa" w:w="60"/>
+              <w:left w:type="dxa" w:w="90"/>
+              <w:bottom w:type="dxa" w:w="60"/>
+              <w:right w:type="dxa" w:w="90"/>
+            </w:tcMar>
+          </w:tcPr>
+          <w:p>
+            <w:pPr>
+              <w:spacing w:after="0"/>
+            </w:pPr>
+            <w:r>
+              <w:rPr>
+                <w:rFonts w:ascii="Microsoft JhengHei" w:cs="Microsoft JhengHei" w:eastAsia="Microsoft JhengHei" w:hAnsi="Microsoft JhengHei"/>
+                <w:sz w:val="19"/>
+                <w:szCs w:val="19"/>
+              </w:rPr>
+              <w:t xml:space="preserve">略過 1</w:t>
+            </w:r>
+          </w:p>
+        </w:tc>
+        <w:tc>
+          <w:tcPr>
+            <w:tcW w:type="dxa" w:w="3462"/>
+            <w:shd w:fill="F5F7FA" w:val="clear"/>
+            <w:tcMar>
+              <w:top w:type="dxa" w:w="60"/>
+              <w:left w:type="dxa" w:w="90"/>
+              <w:bottom w:type="dxa" w:w="60"/>
+              <w:right w:type="dxa" w:w="90"/>
+            </w:tcMar>
+          </w:tcPr>
+          <w:p>
+            <w:pPr>
+              <w:spacing w:after="0"/>
+            </w:pPr>
+            <w:r>
+              <w:rPr>
+                <w:rFonts w:ascii="Microsoft JhengHei" w:cs="Microsoft JhengHei" w:eastAsia="Microsoft JhengHei" w:hAnsi="Microsoft JhengHei"/>
+                <w:sz w:val="19"/>
+                <w:szCs w:val="19"/>
+              </w:rPr>
+              <w:t xml:space="preserve">寬限期</w:t>
+            </w:r>
+          </w:p>
+        </w:tc>
+      </w:tr>
+      <w:tr>
+        <w:tc>
+          <w:tcPr>
+            <w:tcW w:type="dxa" w:w="2433"/>
+            <w:tcMar>
+              <w:top w:type="dxa" w:w="60"/>
+              <w:left w:type="dxa" w:w="90"/>
+              <w:bottom w:type="dxa" w:w="60"/>
+              <w:right w:type="dxa" w:w="90"/>
+            </w:tcMar>
+          </w:tcPr>
+          <w:p>
+            <w:pPr>
+              <w:spacing w:after="0"/>
+            </w:pPr>
+            <w:r>
+              <w:rPr>
+                <w:rFonts w:ascii="Microsoft JhengHei" w:cs="Microsoft JhengHei" w:eastAsia="Microsoft JhengHei" w:hAnsi="Microsoft JhengHei"/>
+                <w:sz w:val="19"/>
+                <w:szCs w:val="19"/>
+              </w:rPr>
+              <w:t xml:space="preserve">08:56:01</w:t>
+            </w:r>
+          </w:p>
+        </w:tc>
+        <w:tc>
+          <w:tcPr>
+            <w:tcW w:type="dxa" w:w="3743"/>
+            <w:tcMar>
+              <w:top w:type="dxa" w:w="60"/>
+              <w:left w:type="dxa" w:w="90"/>
+              <w:bottom w:type="dxa" w:w="60"/>
+              <w:right w:type="dxa" w:w="90"/>
+            </w:tcMar>
+          </w:tcPr>
+          <w:p>
+            <w:pPr>
+              <w:spacing w:after="0"/>
+            </w:pPr>
+            <w:r>
+              <w:rPr>
+                <w:rFonts w:ascii="Microsoft JhengHei" w:cs="Microsoft JhengHei" w:eastAsia="Microsoft JhengHei" w:hAnsi="Microsoft JhengHei"/>
+                <w:sz w:val="19"/>
+                <w:szCs w:val="19"/>
+              </w:rPr>
+              <w:t xml:space="preserve">正常 1</w:t>
+            </w:r>
+          </w:p>
+        </w:tc>
+        <w:tc>
+          <w:tcPr>
+            <w:tcW w:type="dxa" w:w="3462"/>
+            <w:tcMar>
+              <w:top w:type="dxa" w:w="60"/>
+              <w:left w:type="dxa" w:w="90"/>
+              <w:bottom w:type="dxa" w:w="60"/>
+              <w:right w:type="dxa" w:w="90"/>
+            </w:tcMar>
+          </w:tcPr>
+          <w:p>
+            <w:pPr>
+              <w:spacing w:after="0"/>
+            </w:pPr>
+            <w:r>
+              <w:rPr>
+                <w:rFonts w:ascii="Microsoft JhengHei" w:cs="Microsoft JhengHei" w:eastAsia="Microsoft JhengHei" w:hAnsi="Microsoft JhengHei"/>
+                <w:sz w:val="19"/>
+                <w:szCs w:val="19"/>
+              </w:rPr>
+              <w:t xml:space="preserve">guest 開機完成、SSH 恢復</w:t>
+            </w:r>
+          </w:p>
+        </w:tc>
+      </w:tr>
+    </w:tbl>
+    <w:p>
+      <w:pPr>
+        <w:spacing w:after="120"/>
+      </w:pPr>
+    </w:p>
+    <w:p>
+      <w:pPr>
+        <w:shd w:fill="FFF4E5" w:val="clear"/>
+        <w:spacing w:after="140" w:before="60"/>
+        <w:ind w:left="120" w:right="120"/>
+      </w:pPr>
+      <w:r>
+        <w:rPr>
+          <w:rFonts w:ascii="Microsoft JhengHei" w:cs="Microsoft JhengHei" w:eastAsia="Microsoft JhengHei" w:hAnsi="Microsoft JhengHei"/>
+          <w:b/>
+          <w:bCs/>
+          <w:color w:val="9C4500"/>
+          <w:sz w:val="20"/>
+          <w:szCs w:val="20"/>
+        </w:rPr>
+        <w:t xml:space="preserve">注意　</w:t>
+      </w:r>
+      <w:r>
+        <w:rPr>
+          <w:rFonts w:ascii="Microsoft JhengHei" w:cs="Microsoft JhengHei" w:eastAsia="Microsoft JhengHei" w:hAnsi="Microsoft JhengHei"/>
+          <w:b/>
+          <w:bCs/>
+          <w:sz w:val="20"/>
+          <w:szCs w:val="20"/>
+        </w:rPr>
+        <w:t xml:space="preserve">vCenter 不會告訴你 Tools 已被移除。</w:t>
+      </w:r>
+      <w:r>
+        <w:rPr>
+          <w:rFonts w:ascii="Microsoft JhengHei" w:cs="Microsoft JhengHei" w:eastAsia="Microsoft JhengHei" w:hAnsi="Microsoft JhengHei"/>
+          <w:sz w:val="20"/>
+          <w:szCs w:val="20"/>
+        </w:rPr>
+        <w:t xml:space="preserve">移除 Tools 並重開後，vCenter 仍回報 ToolsStatus = toolsNotRunning、ToolsVersionStatus2 = guestToolsUnmanaged（舊值殘留，不會變成 toolsNotInstalled）。實測若不設定可達性判定，腳本會把這台正常運作的 VM 當成「Tools 已裝但當機」而重開（1/3、2/3、3/3 → 硬重置，直到每日上限）。因此本版改為：網路可達即視為健康，優先於 Tools 狀態；並建議所有部署都搭配 -TcpPort。</w:t>
+      </w:r>
+    </w:p>
+    <w:p>
+      <w:pPr>
+        <w:pStyle w:val="Heading2"/>
+        <w:spacing w:after="120" w:before="280"/>
+      </w:pPr>
+      <w:r>
+        <w:rPr>
+          <w:rFonts w:ascii="Microsoft JhengHei" w:cs="Microsoft JhengHei" w:eastAsia="Microsoft JhengHei" w:hAnsi="Microsoft JhengHei"/>
+          <w:b/>
+          <w:bCs/>
+          <w:sz w:val="26"/>
+          <w:szCs w:val="26"/>
+        </w:rPr>
+        <w:t xml:space="preserve">7.5 實測抓到並修正的問題</w:t>
+      </w:r>
+    </w:p>
+    <w:tbl>
+      <w:tblPr>
+        <w:tblW w:type="dxa" w:w="9638"/>
+        <w:tblBorders>
+          <w:top w:val="single" w:color="auto" w:sz="4"/>
+          <w:left w:val="single" w:color="auto" w:sz="4"/>
+          <w:bottom w:val="single" w:color="auto" w:sz="4"/>
+          <w:right w:val="single" w:color="auto" w:sz="4"/>
+          <w:insideH w:val="single" w:color="auto" w:sz="4"/>
+          <w:insideV w:val="single" w:color="auto" w:sz="4"/>
+        </w:tblBorders>
+      </w:tblPr>
+      <w:tblGrid>
+        <w:gridCol w:w="2433"/>
+        <w:gridCol w:w="3743"/>
+        <w:gridCol w:w="3462"/>
+      </w:tblGrid>
+      <w:tr>
+        <w:trPr>
+          <w:tblHeader/>
+        </w:trPr>
+        <w:tc>
+          <w:tcPr>
+            <w:tcW w:type="dxa" w:w="2433"/>
+            <w:shd w:fill="1F3864" w:val="clear"/>
+            <w:tcMar>
+              <w:top w:type="dxa" w:w="60"/>
+              <w:left w:type="dxa" w:w="90"/>
+              <w:bottom w:type="dxa" w:w="60"/>
+              <w:right w:type="dxa" w:w="90"/>
+            </w:tcMar>
+          </w:tcPr>
+          <w:p>
+            <w:pPr>
+              <w:spacing w:after="0"/>
+            </w:pPr>
+            <w:r>
+              <w:rPr>
+                <w:rFonts w:ascii="Microsoft JhengHei" w:cs="Microsoft JhengHei" w:eastAsia="Microsoft JhengHei" w:hAnsi="Microsoft JhengHei"/>
+                <w:b/>
+                <w:bCs/>
+                <w:color w:val="FFFFFF"/>
+                <w:sz w:val="19"/>
+                <w:szCs w:val="19"/>
+              </w:rPr>
+              <w:t xml:space="preserve">問題</w:t>
+            </w:r>
+          </w:p>
+        </w:tc>
+        <w:tc>
+          <w:tcPr>
+            <w:tcW w:type="dxa" w:w="3743"/>
+            <w:shd w:fill="1F3864" w:val="clear"/>
+            <w:tcMar>
+              <w:top w:type="dxa" w:w="60"/>
+              <w:left w:type="dxa" w:w="90"/>
+              <w:bottom w:type="dxa" w:w="60"/>
+              <w:right w:type="dxa" w:w="90"/>
+            </w:tcMar>
+          </w:tcPr>
+          <w:p>
+            <w:pPr>
+              <w:spacing w:after="0"/>
+            </w:pPr>
+            <w:r>
+              <w:rPr>
+                <w:rFonts w:ascii="Microsoft JhengHei" w:cs="Microsoft JhengHei" w:eastAsia="Microsoft JhengHei" w:hAnsi="Microsoft JhengHei"/>
+                <w:b/>
+                <w:bCs/>
+                <w:color w:val="FFFFFF"/>
+                <w:sz w:val="19"/>
+                <w:szCs w:val="19"/>
+              </w:rPr>
+              <w:t xml:space="preserve">現象</w:t>
+            </w:r>
+          </w:p>
+        </w:tc>
+        <w:tc>
+          <w:tcPr>
+            <w:tcW w:type="dxa" w:w="3462"/>
+            <w:shd w:fill="1F3864" w:val="clear"/>
+            <w:tcMar>
+              <w:top w:type="dxa" w:w="60"/>
+              <w:left w:type="dxa" w:w="90"/>
+              <w:bottom w:type="dxa" w:w="60"/>
+              <w:right w:type="dxa" w:w="90"/>
+            </w:tcMar>
+          </w:tcPr>
+          <w:p>
+            <w:pPr>
+              <w:spacing w:after="0"/>
+            </w:pPr>
+            <w:r>
+              <w:rPr>
+                <w:rFonts w:ascii="Microsoft JhengHei" w:cs="Microsoft JhengHei" w:eastAsia="Microsoft JhengHei" w:hAnsi="Microsoft JhengHei"/>
+                <w:b/>
+                <w:bCs/>
+                <w:color w:val="FFFFFF"/>
+                <w:sz w:val="19"/>
+                <w:szCs w:val="19"/>
+              </w:rPr>
+              <w:t xml:space="preserve">處理</w:t>
+            </w:r>
+          </w:p>
+        </w:tc>
+      </w:tr>
+      <w:tr>
+        <w:tc>
+          <w:tcPr>
+            <w:tcW w:type="dxa" w:w="2433"/>
+            <w:tcMar>
+              <w:top w:type="dxa" w:w="60"/>
+              <w:left w:type="dxa" w:w="90"/>
+              <w:bottom w:type="dxa" w:w="60"/>
+              <w:right w:type="dxa" w:w="90"/>
+            </w:tcMar>
+          </w:tcPr>
+          <w:p>
+            <w:pPr>
+              <w:spacing w:after="0"/>
+            </w:pPr>
+            <w:r>
+              <w:rPr>
+                <w:rFonts w:ascii="Microsoft JhengHei" w:cs="Microsoft JhengHei" w:eastAsia="Microsoft JhengHei" w:hAnsi="Microsoft JhengHei"/>
+                <w:sz w:val="19"/>
+                <w:szCs w:val="19"/>
+              </w:rPr>
+              <w:t xml:space="preserve">硬重置不更新 BootTime</w:t>
+            </w:r>
+          </w:p>
+        </w:tc>
+        <w:tc>
+          <w:tcPr>
+            <w:tcW w:type="dxa" w:w="3743"/>
+            <w:tcMar>
+              <w:top w:type="dxa" w:w="60"/>
+              <w:left w:type="dxa" w:w="90"/>
+              <w:bottom w:type="dxa" w:w="60"/>
+              <w:right w:type="dxa" w:w="90"/>
+            </w:tcMar>
+          </w:tcPr>
+          <w:p>
+            <w:pPr>
+              <w:spacing w:after="0"/>
+            </w:pPr>
+            <w:r>
+              <w:rPr>
+                <w:rFonts w:ascii="Microsoft JhengHei" w:cs="Microsoft JhengHei" w:eastAsia="Microsoft JhengHei" w:hAnsi="Microsoft JhengHei"/>
+                <w:sz w:val="19"/>
+                <w:szCs w:val="19"/>
+              </w:rPr>
+              <w:t xml:space="preserve">第一輪重置後 20 秒腳本又判定不健康（靠冷卻機制才擋住）</w:t>
+            </w:r>
+          </w:p>
+        </w:tc>
+        <w:tc>
+          <w:tcPr>
+            <w:tcW w:type="dxa" w:w="3462"/>
+            <w:tcMar>
+              <w:top w:type="dxa" w:w="60"/>
+              <w:left w:type="dxa" w:w="90"/>
+              <w:bottom w:type="dxa" w:w="60"/>
+              <w:right w:type="dxa" w:w="90"/>
+            </w:tcMar>
+          </w:tcPr>
+          <w:p>
+            <w:pPr>
+              <w:spacing w:after="0"/>
+            </w:pPr>
+            <w:r>
+              <w:rPr>
+                <w:rFonts w:ascii="Microsoft JhengHei" w:cs="Microsoft JhengHei" w:eastAsia="Microsoft JhengHei" w:hAnsi="Microsoft JhengHei"/>
+                <w:sz w:val="19"/>
+                <w:szCs w:val="19"/>
+              </w:rPr>
+              <w:t xml:space="preserve">寬限期改以 BootTime 與腳本自己的上次重開時間較晚者起算，第二輪驗證正確</w:t>
+            </w:r>
+          </w:p>
+        </w:tc>
+      </w:tr>
+      <w:tr>
+        <w:tc>
+          <w:tcPr>
+            <w:tcW w:type="dxa" w:w="2433"/>
+            <w:tcMar>
+              <w:top w:type="dxa" w:w="60"/>
+              <w:left w:type="dxa" w:w="90"/>
+              <w:bottom w:type="dxa" w:w="60"/>
+              <w:right w:type="dxa" w:w="90"/>
+            </w:tcMar>
+          </w:tcPr>
+          <w:p>
+            <w:pPr>
+              <w:spacing w:after="0"/>
+            </w:pPr>
+            <w:r>
+              <w:rPr>
+                <w:rFonts w:ascii="Microsoft JhengHei" w:cs="Microsoft JhengHei" w:eastAsia="Microsoft JhengHei" w:hAnsi="Microsoft JhengHei"/>
+                <w:sz w:val="19"/>
+                <w:szCs w:val="19"/>
+              </w:rPr>
+              <w:t xml:space="preserve">Guest 防火牆擋 ICMP</w:t>
+            </w:r>
+          </w:p>
+        </w:tc>
+        <w:tc>
+          <w:tcPr>
+            <w:tcW w:type="dxa" w:w="3743"/>
+            <w:tcMar>
+              <w:top w:type="dxa" w:w="60"/>
+              <w:left w:type="dxa" w:w="90"/>
+              <w:bottom w:type="dxa" w:w="60"/>
+              <w:right w:type="dxa" w:w="90"/>
+            </w:tcMar>
+          </w:tcPr>
+          <w:p>
+            <w:pPr>
+              <w:spacing w:after="0"/>
+            </w:pPr>
+            <w:r>
+              <w:rPr>
+                <w:rFonts w:ascii="Microsoft JhengHei" w:cs="Microsoft JhengHei" w:eastAsia="Microsoft JhengHei" w:hAnsi="Microsoft JhengHei"/>
+                <w:sz w:val="19"/>
+                <w:szCs w:val="19"/>
+              </w:rPr>
+              <w:t xml:space="preserve">Photon OS 預設 iptables INPUT DROP，-Ping 誤判為不通，觸發一次正常重開（Restart-VMGuest）</w:t>
+            </w:r>
+          </w:p>
+        </w:tc>
+        <w:tc>
+          <w:tcPr>
+            <w:tcW w:type="dxa" w:w="3462"/>
+            <w:tcMar>
+              <w:top w:type="dxa" w:w="60"/>
+              <w:left w:type="dxa" w:w="90"/>
+              <w:bottom w:type="dxa" w:w="60"/>
+              <w:right w:type="dxa" w:w="90"/>
+            </w:tcMar>
+          </w:tcPr>
+          <w:p>
+            <w:pPr>
+              <w:spacing w:after="0"/>
+            </w:pPr>
+            <w:r>
+              <w:rPr>
+                <w:rFonts w:ascii="Microsoft JhengHei" w:cs="Microsoft JhengHei" w:eastAsia="Microsoft JhengHei" w:hAnsi="Microsoft JhengHei"/>
+                <w:sz w:val="19"/>
+                <w:szCs w:val="19"/>
+              </w:rPr>
+              <w:t xml:space="preserve">屬 guest 設定問題；使用 -Ping 前須確認目標 VM 放行 ICMP，或改用 Tools 判定</w:t>
+            </w:r>
+          </w:p>
+        </w:tc>
+      </w:tr>
+      <w:tr>
+        <w:tc>
+          <w:tcPr>
+            <w:tcW w:type="dxa" w:w="2433"/>
+            <w:tcMar>
+              <w:top w:type="dxa" w:w="60"/>
+              <w:left w:type="dxa" w:w="90"/>
+              <w:bottom w:type="dxa" w:w="60"/>
+              <w:right w:type="dxa" w:w="90"/>
+            </w:tcMar>
+          </w:tcPr>
+          <w:p>
+            <w:pPr>
+              <w:spacing w:after="0"/>
+            </w:pPr>
+            <w:r>
+              <w:rPr>
+                <w:rFonts w:ascii="Microsoft JhengHei" w:cs="Microsoft JhengHei" w:eastAsia="Microsoft JhengHei" w:hAnsi="Microsoft JhengHei"/>
+                <w:sz w:val="19"/>
+                <w:szCs w:val="19"/>
+              </w:rPr>
               <w:t xml:space="preserve">Tools 狀態更新有延遲</w:t>
             </w:r>
           </w:p>
@@ -7575,6 +8853,80 @@
                 <w:szCs w:val="19"/>
               </w:rPr>
               <w:t xml:space="preserve">正常現象；FailThreshold ≥ 2 即可涵蓋</w:t>
+            </w:r>
+          </w:p>
+        </w:tc>
+      </w:tr>
+      <w:tr>
+        <w:tc>
+          <w:tcPr>
+            <w:tcW w:type="dxa" w:w="2433"/>
+            <w:tcMar>
+              <w:top w:type="dxa" w:w="60"/>
+              <w:left w:type="dxa" w:w="90"/>
+              <w:bottom w:type="dxa" w:w="60"/>
+              <w:right w:type="dxa" w:w="90"/>
+            </w:tcMar>
+          </w:tcPr>
+          <w:p>
+            <w:pPr>
+              <w:spacing w:after="0"/>
+            </w:pPr>
+            <w:r>
+              <w:rPr>
+                <w:rFonts w:ascii="Microsoft JhengHei" w:cs="Microsoft JhengHei" w:eastAsia="Microsoft JhengHei" w:hAnsi="Microsoft JhengHei"/>
+                <w:sz w:val="19"/>
+                <w:szCs w:val="19"/>
+              </w:rPr>
+              <w:t xml:space="preserve">Tools 移除後 vCenter 殘留舊狀態</w:t>
+            </w:r>
+          </w:p>
+        </w:tc>
+        <w:tc>
+          <w:tcPr>
+            <w:tcW w:type="dxa" w:w="3743"/>
+            <w:tcMar>
+              <w:top w:type="dxa" w:w="60"/>
+              <w:left w:type="dxa" w:w="90"/>
+              <w:bottom w:type="dxa" w:w="60"/>
+              <w:right w:type="dxa" w:w="90"/>
+            </w:tcMar>
+          </w:tcPr>
+          <w:p>
+            <w:pPr>
+              <w:spacing w:after="0"/>
+            </w:pPr>
+            <w:r>
+              <w:rPr>
+                <w:rFonts w:ascii="Microsoft JhengHei" w:cs="Microsoft JhengHei" w:eastAsia="Microsoft JhengHei" w:hAnsi="Microsoft JhengHei"/>
+                <w:sz w:val="19"/>
+                <w:szCs w:val="19"/>
+              </w:rPr>
+              <w:t xml:space="preserve">沒 Tools 的 VM 被當成「已裝但當機」，DryRun 顯示會重開</w:t>
+            </w:r>
+          </w:p>
+        </w:tc>
+        <w:tc>
+          <w:tcPr>
+            <w:tcW w:type="dxa" w:w="3462"/>
+            <w:tcMar>
+              <w:top w:type="dxa" w:w="60"/>
+              <w:left w:type="dxa" w:w="90"/>
+              <w:bottom w:type="dxa" w:w="60"/>
+              <w:right w:type="dxa" w:w="90"/>
+            </w:tcMar>
+          </w:tcPr>
+          <w:p>
+            <w:pPr>
+              <w:spacing w:after="0"/>
+            </w:pPr>
+            <w:r>
+              <w:rPr>
+                <w:rFonts w:ascii="Microsoft JhengHei" w:cs="Microsoft JhengHei" w:eastAsia="Microsoft JhengHei" w:hAnsi="Microsoft JhengHei"/>
+                <w:sz w:val="19"/>
+                <w:szCs w:val="19"/>
+              </w:rPr>
+              <w:t xml:space="preserve">網路可達優先於 Tools 判定；新增 -TcpPort / -ResolveDns</w:t>
             </w:r>
           </w:p>
         </w:tc>
@@ -7682,7 +9034,7 @@
           <w:sz w:val="20"/>
           <w:szCs w:val="20"/>
         </w:rPr>
-        <w:t xml:space="preserve">guest 防火牆或中間網路擋 ICMP 會造成誤判。</w:t>
+        <w:t xml:space="preserve">guest 防火牆或中間網路擋 ICMP 會造成誤判；建議改用或加上 -TcpPort。</w:t>
       </w:r>
     </w:p>
     <w:p>
@@ -7702,7 +9054,7 @@
           <w:sz w:val="20"/>
           <w:szCs w:val="20"/>
         </w:rPr>
-        <w:t xml:space="preserve">被其他系統接管的 VM 可能無法操作。</w:t>
+        <w:t xml:space="preserve">沒 Tools 的 VM 一定要給可達性目標。</w:t>
       </w:r>
       <w:r>
         <w:rPr>
@@ -7710,7 +9062,7 @@
           <w:sz w:val="20"/>
           <w:szCs w:val="20"/>
         </w:rPr>
-        <w:t xml:space="preserve">例如 VMware Cloud Director 管理的 VM，vCenter 會回「The method is disabled by …」，腳本會記 ERROR 並跳過。</w:t>
+        <w:t xml:space="preserve">vCenter 的 Tools 狀態可能是移除後殘留的舊值，只靠 Tools 判定會誤重開；用 -ResolveDns（或 -PingMap）搭配 -TcpPort。</w:t>
       </w:r>
     </w:p>
     <w:p>
@@ -7730,7 +9082,7 @@
           <w:sz w:val="20"/>
           <w:szCs w:val="20"/>
         </w:rPr>
-        <w:t xml:space="preserve">主機故障不在範圍。</w:t>
+        <w:t xml:space="preserve">被其他系統接管的 VM 可能無法操作。</w:t>
       </w:r>
       <w:r>
         <w:rPr>
@@ -7738,7 +9090,7 @@
           <w:sz w:val="20"/>
           <w:szCs w:val="20"/>
         </w:rPr>
-        <w:t xml:space="preserve">主機 disconnected 時 VM 一律略過，由 vSphere HA 處理。</w:t>
+        <w:t xml:space="preserve">例如 VMware Cloud Director 管理的 VM，vCenter 會回「The method is disabled by …」，腳本會記 ERROR 並跳過。</w:t>
       </w:r>
     </w:p>
     <w:p>
@@ -7758,6 +9110,34 @@
           <w:sz w:val="20"/>
           <w:szCs w:val="20"/>
         </w:rPr>
+        <w:t xml:space="preserve">主機故障不在範圍。</w:t>
+      </w:r>
+      <w:r>
+        <w:rPr>
+          <w:rFonts w:ascii="Microsoft JhengHei" w:cs="Microsoft JhengHei" w:eastAsia="Microsoft JhengHei" w:hAnsi="Microsoft JhengHei"/>
+          <w:sz w:val="20"/>
+          <w:szCs w:val="20"/>
+        </w:rPr>
+        <w:t xml:space="preserve">主機 disconnected 時 VM 一律略過，由 vSphere HA 處理。</w:t>
+      </w:r>
+    </w:p>
+    <w:p>
+      <w:pPr>
+        <w:pStyle w:val="ListParagraph"/>
+        <w:numPr>
+          <w:ilvl w:val="0"/>
+          <w:numId w:val="2"/>
+        </w:numPr>
+        <w:spacing w:after="60"/>
+      </w:pPr>
+      <w:r>
+        <w:rPr>
+          <w:rFonts w:ascii="Microsoft JhengHei" w:cs="Microsoft JhengHei" w:eastAsia="Microsoft JhengHei" w:hAnsi="Microsoft JhengHei"/>
+          <w:b/>
+          <w:bCs/>
+          <w:sz w:val="20"/>
+          <w:szCs w:val="20"/>
+        </w:rPr>
         <w:t xml:space="preserve">狀態檔為單一執行個體設計。</w:t>
       </w:r>
       <w:r>
@@ -7805,7 +9185,7 @@
           <w:sz w:val="20"/>
           <w:szCs w:val="20"/>
         </w:rPr>
-        <w:t xml:space="preserve">　沒有 ping 目標時會略過並在 verbose 顯示「無法判定」；請用 -Ping -PingMap 指定 IP。</w:t>
+        <w:t xml:space="preserve">　沒有可達性目標時會略過並在 verbose 顯示「無法判定」；用 -ResolveDns -DnsSuffix &lt;網域&gt; -TcpPort 22,3389 讓它以 DNS 查 IP、TCP port 判定（見 5.5）。</w:t>
       </w:r>
     </w:p>
     <w:p>
@@ -8023,7 +9403,23 @@
           <w:sz w:val="17"/>
           <w:szCs w:val="17"/>
         </w:rPr>
-        <w:t xml:space="preserve">      2. (-Ping) guest IP ping 不通(IP 來自 Tools 回報,或 -PingMap 指定)</w:t>
+        <w:t xml:space="preserve">      2. (-Ping / -TcpPort) guest IP ICMP 不通、且指定的 TCP port 都連不上</w:t>
+      </w:r>
+    </w:p>
+    <w:p>
+      <w:pPr>
+        <w:keepNext/>
+        <w:shd w:fill="F3F3F3" w:val="clear"/>
+        <w:spacing w:after="0" w:before="0" w:line="260"/>
+        <w:ind w:left="120" w:right="120"/>
+      </w:pPr>
+      <w:r>
+        <w:rPr>
+          <w:rFonts w:ascii="Consolas" w:cs="Consolas" w:eastAsia="Consolas" w:hAnsi="Consolas"/>
+          <w:sz w:val="17"/>
+          <w:szCs w:val="17"/>
+        </w:rPr>
+        <w:t xml:space="preserve">         IP 來源:-PingMap 指定 &gt; Tools 回報 &gt; (-ResolveDns) 以 VM 名稱查 DNS</w:t>
       </w:r>
     </w:p>
     <w:p>
@@ -8247,7 +9643,7 @@
           <w:sz w:val="17"/>
           <w:szCs w:val="17"/>
         </w:rPr>
-        <w:t xml:space="preserve">    # 沒裝 Tools 的 VM 用 ping 判定</w:t>
+        <w:t xml:space="preserve">    # 沒裝 Tools 的 VM:指定 IP 用 ping 判定</w:t>
       </w:r>
     </w:p>
     <w:p>
@@ -8279,6 +9675,54 @@
           <w:sz w:val="17"/>
           <w:szCs w:val="17"/>
         </w:rPr>
+        <w:t xml:space="preserve">.EXAMPLE</w:t>
+      </w:r>
+    </w:p>
+    <w:p>
+      <w:pPr>
+        <w:keepNext/>
+        <w:shd w:fill="F3F3F3" w:val="clear"/>
+        <w:spacing w:after="0" w:before="0" w:line="260"/>
+        <w:ind w:left="120" w:right="120"/>
+      </w:pPr>
+      <w:r>
+        <w:rPr>
+          <w:rFonts w:ascii="Consolas" w:cs="Consolas" w:eastAsia="Consolas" w:hAnsi="Consolas"/>
+          <w:sz w:val="17"/>
+          <w:szCs w:val="17"/>
+        </w:rPr>
+        <w:t xml:space="preserve">    # 沒裝 Tools 的 VM:VM 名稱查 DNS 取 IP,改用 TCP port(SSH / RDP)判定,不怕 ICMP 被擋</w:t>
+      </w:r>
+    </w:p>
+    <w:p>
+      <w:pPr>
+        <w:keepNext/>
+        <w:shd w:fill="F3F3F3" w:val="clear"/>
+        <w:spacing w:after="0" w:before="0" w:line="260"/>
+        <w:ind w:left="120" w:right="120"/>
+      </w:pPr>
+      <w:r>
+        <w:rPr>
+          <w:rFonts w:ascii="Consolas" w:cs="Consolas" w:eastAsia="Consolas" w:hAnsi="Consolas"/>
+          <w:sz w:val="17"/>
+          <w:szCs w:val="17"/>
+        </w:rPr>
+        <w:t xml:space="preserve">    pwsh ./Watch-VMHealth.ps1 -Server vc01.example.com -Credential $cred -Tag AutoRestart -ResolveDns -DnsSuffix example.com -TcpPort 22,3389 -Loop</w:t>
+      </w:r>
+    </w:p>
+    <w:p>
+      <w:pPr>
+        <w:keepNext/>
+        <w:shd w:fill="F3F3F3" w:val="clear"/>
+        <w:spacing w:after="0" w:before="0" w:line="260"/>
+        <w:ind w:left="120" w:right="120"/>
+      </w:pPr>
+      <w:r>
+        <w:rPr>
+          <w:rFonts w:ascii="Consolas" w:cs="Consolas" w:eastAsia="Consolas" w:hAnsi="Consolas"/>
+          <w:sz w:val="17"/>
+          <w:szCs w:val="17"/>
+        </w:rPr>
         <w:t xml:space="preserve">.NOTES</w:t>
       </w:r>
     </w:p>
@@ -8583,6 +10027,22 @@
           <w:sz w:val="17"/>
           <w:szCs w:val="17"/>
         </w:rPr>
+        <w:t xml:space="preserve">  [int[]]    $TcpPort,                        # 額外用 TCP 連線判定(任一 port 通就算可達),例如 22,3389,443</w:t>
+      </w:r>
+    </w:p>
+    <w:p>
+      <w:pPr>
+        <w:keepNext/>
+        <w:shd w:fill="F3F3F3" w:val="clear"/>
+        <w:spacing w:after="0" w:before="0" w:line="260"/>
+        <w:ind w:left="120" w:right="120"/>
+      </w:pPr>
+      <w:r>
+        <w:rPr>
+          <w:rFonts w:ascii="Consolas" w:cs="Consolas" w:eastAsia="Consolas" w:hAnsi="Consolas"/>
+          <w:sz w:val="17"/>
+          <w:szCs w:val="17"/>
+        </w:rPr>
         <w:t xml:space="preserve">  [hashtable]$PingMap    = @{},               # VM 名 → IP,沒 Tools 的 VM 用</w:t>
       </w:r>
     </w:p>
@@ -8599,6 +10059,38 @@
           <w:sz w:val="17"/>
           <w:szCs w:val="17"/>
         </w:rPr>
+        <w:t xml:space="preserve">  [switch]   $ResolveDns,                     # 沒 Tools 也沒 PingMap 時,用 VM 名稱查 DNS 取 IP</w:t>
+      </w:r>
+    </w:p>
+    <w:p>
+      <w:pPr>
+        <w:keepNext/>
+        <w:shd w:fill="F3F3F3" w:val="clear"/>
+        <w:spacing w:after="0" w:before="0" w:line="260"/>
+        <w:ind w:left="120" w:right="120"/>
+      </w:pPr>
+      <w:r>
+        <w:rPr>
+          <w:rFonts w:ascii="Consolas" w:cs="Consolas" w:eastAsia="Consolas" w:hAnsi="Consolas"/>
+          <w:sz w:val="17"/>
+          <w:szCs w:val="17"/>
+        </w:rPr>
+        <w:t xml:space="preserve">  [string]   $DnsSuffix,                      # -ResolveDns 時附加的網域,例如 example.com</w:t>
+      </w:r>
+    </w:p>
+    <w:p>
+      <w:pPr>
+        <w:keepNext/>
+        <w:shd w:fill="F3F3F3" w:val="clear"/>
+        <w:spacing w:after="0" w:before="0" w:line="260"/>
+        <w:ind w:left="120" w:right="120"/>
+      </w:pPr>
+      <w:r>
+        <w:rPr>
+          <w:rFonts w:ascii="Consolas" w:cs="Consolas" w:eastAsia="Consolas" w:hAnsi="Consolas"/>
+          <w:sz w:val="17"/>
+          <w:szCs w:val="17"/>
+        </w:rPr>
         <w:t xml:space="preserve">  [switch]   $PowerOnIfOff,                   # poweredOff 也視為壞掉並開機</w:t>
       </w:r>
     </w:p>
@@ -9031,6 +10523,294 @@
           <w:sz w:val="17"/>
           <w:szCs w:val="17"/>
         </w:rPr>
+        <w:t xml:space="preserve"># ---------- 網路可達性 ----------</w:t>
+      </w:r>
+    </w:p>
+    <w:p>
+      <w:pPr>
+        <w:keepNext/>
+        <w:shd w:fill="F3F3F3" w:val="clear"/>
+        <w:spacing w:after="0" w:before="0" w:line="260"/>
+        <w:ind w:left="120" w:right="120"/>
+      </w:pPr>
+      <w:r>
+        <w:rPr>
+          <w:rFonts w:ascii="Consolas" w:cs="Consolas" w:eastAsia="Consolas" w:hAnsi="Consolas"/>
+          <w:sz w:val="17"/>
+          <w:szCs w:val="17"/>
+        </w:rPr>
+        <w:t xml:space="preserve">function Resolve-VmIp($name) {</w:t>
+      </w:r>
+    </w:p>
+    <w:p>
+      <w:pPr>
+        <w:keepNext/>
+        <w:shd w:fill="F3F3F3" w:val="clear"/>
+        <w:spacing w:after="0" w:before="0" w:line="260"/>
+        <w:ind w:left="120" w:right="120"/>
+      </w:pPr>
+      <w:r>
+        <w:rPr>
+          <w:rFonts w:ascii="Consolas" w:cs="Consolas" w:eastAsia="Consolas" w:hAnsi="Consolas"/>
+          <w:sz w:val="17"/>
+          <w:szCs w:val="17"/>
+        </w:rPr>
+        <w:t xml:space="preserve">  $fqdn = if ($DnsSuffix -and $name -notlike "*.$DnsSuffix") { "$name.$DnsSuffix" } else { $name }</w:t>
+      </w:r>
+    </w:p>
+    <w:p>
+      <w:pPr>
+        <w:keepNext/>
+        <w:shd w:fill="F3F3F3" w:val="clear"/>
+        <w:spacing w:after="0" w:before="0" w:line="260"/>
+        <w:ind w:left="120" w:right="120"/>
+      </w:pPr>
+      <w:r>
+        <w:rPr>
+          <w:rFonts w:ascii="Consolas" w:cs="Consolas" w:eastAsia="Consolas" w:hAnsi="Consolas"/>
+          <w:sz w:val="17"/>
+          <w:szCs w:val="17"/>
+        </w:rPr>
+        <w:t xml:space="preserve">  try {</w:t>
+      </w:r>
+    </w:p>
+    <w:p>
+      <w:pPr>
+        <w:keepNext/>
+        <w:shd w:fill="F3F3F3" w:val="clear"/>
+        <w:spacing w:after="0" w:before="0" w:line="260"/>
+        <w:ind w:left="120" w:right="120"/>
+      </w:pPr>
+      <w:r>
+        <w:rPr>
+          <w:rFonts w:ascii="Consolas" w:cs="Consolas" w:eastAsia="Consolas" w:hAnsi="Consolas"/>
+          <w:sz w:val="17"/>
+          <w:szCs w:val="17"/>
+        </w:rPr>
+        <w:t xml:space="preserve">    $a = [System.Net.Dns]::GetHostAddresses($fqdn) | Where-Object { $_.AddressFamily -eq 'InterNetwork' } | Select-Object -First 1</w:t>
+      </w:r>
+    </w:p>
+    <w:p>
+      <w:pPr>
+        <w:keepNext/>
+        <w:shd w:fill="F3F3F3" w:val="clear"/>
+        <w:spacing w:after="0" w:before="0" w:line="260"/>
+        <w:ind w:left="120" w:right="120"/>
+      </w:pPr>
+      <w:r>
+        <w:rPr>
+          <w:rFonts w:ascii="Consolas" w:cs="Consolas" w:eastAsia="Consolas" w:hAnsi="Consolas"/>
+          <w:sz w:val="17"/>
+          <w:szCs w:val="17"/>
+        </w:rPr>
+        <w:t xml:space="preserve">    if ($a) { return $a.IPAddressToString }</w:t>
+      </w:r>
+    </w:p>
+    <w:p>
+      <w:pPr>
+        <w:keepNext/>
+        <w:shd w:fill="F3F3F3" w:val="clear"/>
+        <w:spacing w:after="0" w:before="0" w:line="260"/>
+        <w:ind w:left="120" w:right="120"/>
+      </w:pPr>
+      <w:r>
+        <w:rPr>
+          <w:rFonts w:ascii="Consolas" w:cs="Consolas" w:eastAsia="Consolas" w:hAnsi="Consolas"/>
+          <w:sz w:val="17"/>
+          <w:szCs w:val="17"/>
+        </w:rPr>
+        <w:t xml:space="preserve">  } catch {}</w:t>
+      </w:r>
+    </w:p>
+    <w:p>
+      <w:pPr>
+        <w:keepNext/>
+        <w:shd w:fill="F3F3F3" w:val="clear"/>
+        <w:spacing w:after="0" w:before="0" w:line="260"/>
+        <w:ind w:left="120" w:right="120"/>
+      </w:pPr>
+      <w:r>
+        <w:rPr>
+          <w:rFonts w:ascii="Consolas" w:cs="Consolas" w:eastAsia="Consolas" w:hAnsi="Consolas"/>
+          <w:sz w:val="17"/>
+          <w:szCs w:val="17"/>
+        </w:rPr>
+        <w:t xml:space="preserve">  return $null</w:t>
+      </w:r>
+    </w:p>
+    <w:p>
+      <w:pPr>
+        <w:keepNext/>
+        <w:shd w:fill="F3F3F3" w:val="clear"/>
+        <w:spacing w:after="0" w:before="0" w:line="260"/>
+        <w:ind w:left="120" w:right="120"/>
+      </w:pPr>
+      <w:r>
+        <w:rPr>
+          <w:rFonts w:ascii="Consolas" w:cs="Consolas" w:eastAsia="Consolas" w:hAnsi="Consolas"/>
+          <w:sz w:val="17"/>
+          <w:szCs w:val="17"/>
+        </w:rPr>
+        <w:t xml:space="preserve">}</w:t>
+      </w:r>
+    </w:p>
+    <w:p>
+      <w:pPr>
+        <w:keepNext/>
+        <w:shd w:fill="F3F3F3" w:val="clear"/>
+        <w:spacing w:after="0" w:before="0" w:line="260"/>
+        <w:ind w:left="120" w:right="120"/>
+      </w:pPr>
+      <w:r>
+        <w:rPr>
+          <w:rFonts w:ascii="Consolas" w:cs="Consolas" w:eastAsia="Consolas" w:hAnsi="Consolas"/>
+          <w:sz w:val="17"/>
+          <w:szCs w:val="17"/>
+        </w:rPr>
+        <w:t xml:space="preserve">function Test-TcpPort($ip, $port, $timeoutMs = 2000) {</w:t>
+      </w:r>
+    </w:p>
+    <w:p>
+      <w:pPr>
+        <w:keepNext/>
+        <w:shd w:fill="F3F3F3" w:val="clear"/>
+        <w:spacing w:after="0" w:before="0" w:line="260"/>
+        <w:ind w:left="120" w:right="120"/>
+      </w:pPr>
+      <w:r>
+        <w:rPr>
+          <w:rFonts w:ascii="Consolas" w:cs="Consolas" w:eastAsia="Consolas" w:hAnsi="Consolas"/>
+          <w:sz w:val="17"/>
+          <w:szCs w:val="17"/>
+        </w:rPr>
+        <w:t xml:space="preserve">  $c = [System.Net.Sockets.TcpClient]::new()</w:t>
+      </w:r>
+    </w:p>
+    <w:p>
+      <w:pPr>
+        <w:keepNext/>
+        <w:shd w:fill="F3F3F3" w:val="clear"/>
+        <w:spacing w:after="0" w:before="0" w:line="260"/>
+        <w:ind w:left="120" w:right="120"/>
+      </w:pPr>
+      <w:r>
+        <w:rPr>
+          <w:rFonts w:ascii="Consolas" w:cs="Consolas" w:eastAsia="Consolas" w:hAnsi="Consolas"/>
+          <w:sz w:val="17"/>
+          <w:szCs w:val="17"/>
+        </w:rPr>
+        <w:t xml:space="preserve">  try {</w:t>
+      </w:r>
+    </w:p>
+    <w:p>
+      <w:pPr>
+        <w:keepNext/>
+        <w:shd w:fill="F3F3F3" w:val="clear"/>
+        <w:spacing w:after="0" w:before="0" w:line="260"/>
+        <w:ind w:left="120" w:right="120"/>
+      </w:pPr>
+      <w:r>
+        <w:rPr>
+          <w:rFonts w:ascii="Consolas" w:cs="Consolas" w:eastAsia="Consolas" w:hAnsi="Consolas"/>
+          <w:sz w:val="17"/>
+          <w:szCs w:val="17"/>
+        </w:rPr>
+        <w:t xml:space="preserve">    $r = $c.ConnectAsync($ip, $port)</w:t>
+      </w:r>
+    </w:p>
+    <w:p>
+      <w:pPr>
+        <w:keepNext/>
+        <w:shd w:fill="F3F3F3" w:val="clear"/>
+        <w:spacing w:after="0" w:before="0" w:line="260"/>
+        <w:ind w:left="120" w:right="120"/>
+      </w:pPr>
+      <w:r>
+        <w:rPr>
+          <w:rFonts w:ascii="Consolas" w:cs="Consolas" w:eastAsia="Consolas" w:hAnsi="Consolas"/>
+          <w:sz w:val="17"/>
+          <w:szCs w:val="17"/>
+        </w:rPr>
+        <w:t xml:space="preserve">    if ($r.Wait($timeoutMs) -and $c.Connected) { return $true }</w:t>
+      </w:r>
+    </w:p>
+    <w:p>
+      <w:pPr>
+        <w:keepNext/>
+        <w:shd w:fill="F3F3F3" w:val="clear"/>
+        <w:spacing w:after="0" w:before="0" w:line="260"/>
+        <w:ind w:left="120" w:right="120"/>
+      </w:pPr>
+      <w:r>
+        <w:rPr>
+          <w:rFonts w:ascii="Consolas" w:cs="Consolas" w:eastAsia="Consolas" w:hAnsi="Consolas"/>
+          <w:sz w:val="17"/>
+          <w:szCs w:val="17"/>
+        </w:rPr>
+        <w:t xml:space="preserve">  } catch {} finally { $c.Dispose() }</w:t>
+      </w:r>
+    </w:p>
+    <w:p>
+      <w:pPr>
+        <w:keepNext/>
+        <w:shd w:fill="F3F3F3" w:val="clear"/>
+        <w:spacing w:after="0" w:before="0" w:line="260"/>
+        <w:ind w:left="120" w:right="120"/>
+      </w:pPr>
+      <w:r>
+        <w:rPr>
+          <w:rFonts w:ascii="Consolas" w:cs="Consolas" w:eastAsia="Consolas" w:hAnsi="Consolas"/>
+          <w:sz w:val="17"/>
+          <w:szCs w:val="17"/>
+        </w:rPr>
+        <w:t xml:space="preserve">  return $false</w:t>
+      </w:r>
+    </w:p>
+    <w:p>
+      <w:pPr>
+        <w:keepNext/>
+        <w:shd w:fill="F3F3F3" w:val="clear"/>
+        <w:spacing w:after="0" w:before="0" w:line="260"/>
+        <w:ind w:left="120" w:right="120"/>
+      </w:pPr>
+      <w:r>
+        <w:rPr>
+          <w:rFonts w:ascii="Consolas" w:cs="Consolas" w:eastAsia="Consolas" w:hAnsi="Consolas"/>
+          <w:sz w:val="17"/>
+          <w:szCs w:val="17"/>
+        </w:rPr>
+        <w:t xml:space="preserve">}</w:t>
+      </w:r>
+    </w:p>
+    <w:p>
+      <w:pPr>
+        <w:keepNext/>
+        <w:shd w:fill="F3F3F3" w:val="clear"/>
+        <w:spacing w:after="0" w:before="0" w:line="260"/>
+        <w:ind w:left="120" w:right="120"/>
+      </w:pPr>
+      <w:r>
+        <w:rPr>
+          <w:rFonts w:ascii="Consolas" w:cs="Consolas" w:eastAsia="Consolas" w:hAnsi="Consolas"/>
+          <w:sz w:val="17"/>
+          <w:szCs w:val="17"/>
+        </w:rPr>
+        <w:t xml:space="preserve"> </w:t>
+      </w:r>
+    </w:p>
+    <w:p>
+      <w:pPr>
+        <w:keepNext/>
+        <w:shd w:fill="F3F3F3" w:val="clear"/>
+        <w:spacing w:after="0" w:before="0" w:line="260"/>
+        <w:ind w:left="120" w:right="120"/>
+      </w:pPr>
+      <w:r>
+        <w:rPr>
+          <w:rFonts w:ascii="Consolas" w:cs="Consolas" w:eastAsia="Consolas" w:hAnsi="Consolas"/>
+          <w:sz w:val="17"/>
+          <w:szCs w:val="17"/>
+        </w:rPr>
         <w:t xml:space="preserve"># ---------- 健康判定 ----------</w:t>
       </w:r>
     </w:p>
@@ -9655,23 +11435,55 @@
           <w:sz w:val="17"/>
           <w:szCs w:val="17"/>
         </w:rPr>
-        <w:t xml:space="preserve">  $ip = $null</w:t>
-      </w:r>
-    </w:p>
-    <w:p>
-      <w:pPr>
-        <w:keepNext/>
-        <w:shd w:fill="F3F3F3" w:val="clear"/>
-        <w:spacing w:after="0" w:before="0" w:line="260"/>
-        <w:ind w:left="120" w:right="120"/>
-      </w:pPr>
-      <w:r>
-        <w:rPr>
-          <w:rFonts w:ascii="Consolas" w:cs="Consolas" w:eastAsia="Consolas" w:hAnsi="Consolas"/>
-          <w:sz w:val="17"/>
-          <w:szCs w:val="17"/>
-        </w:rPr>
-        <w:t xml:space="preserve">  if ($Ping) {</w:t>
+        <w:t xml:space="preserve">  # 網路可達性判定(-Ping ICMP / -TcpPort TCP 連線,任一通就算可達)</w:t>
+      </w:r>
+    </w:p>
+    <w:p>
+      <w:pPr>
+        <w:keepNext/>
+        <w:shd w:fill="F3F3F3" w:val="clear"/>
+        <w:spacing w:after="0" w:before="0" w:line="260"/>
+        <w:ind w:left="120" w:right="120"/>
+      </w:pPr>
+      <w:r>
+        <w:rPr>
+          <w:rFonts w:ascii="Consolas" w:cs="Consolas" w:eastAsia="Consolas" w:hAnsi="Consolas"/>
+          <w:sz w:val="17"/>
+          <w:szCs w:val="17"/>
+        </w:rPr>
+        <w:t xml:space="preserve">  # 目標 IP 來源優先序:-PingMap 指定 &gt; Tools 回報 &gt; (-ResolveDns) 以 VM 名稱查 DNS</w:t>
+      </w:r>
+    </w:p>
+    <w:p>
+      <w:pPr>
+        <w:keepNext/>
+        <w:shd w:fill="F3F3F3" w:val="clear"/>
+        <w:spacing w:after="0" w:before="0" w:line="260"/>
+        <w:ind w:left="120" w:right="120"/>
+      </w:pPr>
+      <w:r>
+        <w:rPr>
+          <w:rFonts w:ascii="Consolas" w:cs="Consolas" w:eastAsia="Consolas" w:hAnsi="Consolas"/>
+          <w:sz w:val="17"/>
+          <w:szCs w:val="17"/>
+        </w:rPr>
+        <w:t xml:space="preserve">  $ip = $null; $reachChecked = $false; $reach = $false</w:t>
+      </w:r>
+    </w:p>
+    <w:p>
+      <w:pPr>
+        <w:keepNext/>
+        <w:shd w:fill="F3F3F3" w:val="clear"/>
+        <w:spacing w:after="0" w:before="0" w:line="260"/>
+        <w:ind w:left="120" w:right="120"/>
+      </w:pPr>
+      <w:r>
+        <w:rPr>
+          <w:rFonts w:ascii="Consolas" w:cs="Consolas" w:eastAsia="Consolas" w:hAnsi="Consolas"/>
+          <w:sz w:val="17"/>
+          <w:szCs w:val="17"/>
+        </w:rPr>
+        <w:t xml:space="preserve">  if ($Ping -or $TcpPort) {</w:t>
       </w:r>
     </w:p>
     <w:p>
@@ -9719,6 +11531,22 @@
           <w:sz w:val="17"/>
           <w:szCs w:val="17"/>
         </w:rPr>
+        <w:t xml:space="preserve">    elseif ($ResolveDns) { $ip = Resolve-VmIp $vm.Name }</w:t>
+      </w:r>
+    </w:p>
+    <w:p>
+      <w:pPr>
+        <w:keepNext/>
+        <w:shd w:fill="F3F3F3" w:val="clear"/>
+        <w:spacing w:after="0" w:before="0" w:line="260"/>
+        <w:ind w:left="120" w:right="120"/>
+      </w:pPr>
+      <w:r>
+        <w:rPr>
+          <w:rFonts w:ascii="Consolas" w:cs="Consolas" w:eastAsia="Consolas" w:hAnsi="Consolas"/>
+          <w:sz w:val="17"/>
+          <w:szCs w:val="17"/>
+        </w:rPr>
         <w:t xml:space="preserve">    if ($ip) {</w:t>
       </w:r>
     </w:p>
@@ -9735,23 +11563,151 @@
           <w:sz w:val="17"/>
           <w:szCs w:val="17"/>
         </w:rPr>
-        <w:t xml:space="preserve">      $ok = Test-Connection -TargetName $ip -Count 2 -TimeoutSeconds 2 -Quiet -ErrorAction SilentlyContinue</w:t>
-      </w:r>
-    </w:p>
-    <w:p>
-      <w:pPr>
-        <w:keepNext/>
-        <w:shd w:fill="F3F3F3" w:val="clear"/>
-        <w:spacing w:after="0" w:before="0" w:line="260"/>
-        <w:ind w:left="120" w:right="120"/>
-      </w:pPr>
-      <w:r>
-        <w:rPr>
-          <w:rFonts w:ascii="Consolas" w:cs="Consolas" w:eastAsia="Consolas" w:hAnsi="Consolas"/>
-          <w:sz w:val="17"/>
-          <w:szCs w:val="17"/>
-        </w:rPr>
-        <w:t xml:space="preserve">      if (-not $ok) { $reasons += "ping $ip 不通" }</w:t>
+        <w:t xml:space="preserve">      $checks = @(); $reach = $false; $reachChecked = $true</w:t>
+      </w:r>
+    </w:p>
+    <w:p>
+      <w:pPr>
+        <w:keepNext/>
+        <w:shd w:fill="F3F3F3" w:val="clear"/>
+        <w:spacing w:after="0" w:before="0" w:line="260"/>
+        <w:ind w:left="120" w:right="120"/>
+      </w:pPr>
+      <w:r>
+        <w:rPr>
+          <w:rFonts w:ascii="Consolas" w:cs="Consolas" w:eastAsia="Consolas" w:hAnsi="Consolas"/>
+          <w:sz w:val="17"/>
+          <w:szCs w:val="17"/>
+        </w:rPr>
+        <w:t xml:space="preserve">      if ($Ping) {</w:t>
+      </w:r>
+    </w:p>
+    <w:p>
+      <w:pPr>
+        <w:keepNext/>
+        <w:shd w:fill="F3F3F3" w:val="clear"/>
+        <w:spacing w:after="0" w:before="0" w:line="260"/>
+        <w:ind w:left="120" w:right="120"/>
+      </w:pPr>
+      <w:r>
+        <w:rPr>
+          <w:rFonts w:ascii="Consolas" w:cs="Consolas" w:eastAsia="Consolas" w:hAnsi="Consolas"/>
+          <w:sz w:val="17"/>
+          <w:szCs w:val="17"/>
+        </w:rPr>
+        <w:t xml:space="preserve">        $ok = Test-Connection -TargetName $ip -Count 2 -TimeoutSeconds 2 -Quiet -ErrorAction SilentlyContinue</w:t>
+      </w:r>
+    </w:p>
+    <w:p>
+      <w:pPr>
+        <w:keepNext/>
+        <w:shd w:fill="F3F3F3" w:val="clear"/>
+        <w:spacing w:after="0" w:before="0" w:line="260"/>
+        <w:ind w:left="120" w:right="120"/>
+      </w:pPr>
+      <w:r>
+        <w:rPr>
+          <w:rFonts w:ascii="Consolas" w:cs="Consolas" w:eastAsia="Consolas" w:hAnsi="Consolas"/>
+          <w:sz w:val="17"/>
+          <w:szCs w:val="17"/>
+        </w:rPr>
+        <w:t xml:space="preserve">        if ($ok) { $reach = $true } else { $checks += 'ping' }</w:t>
+      </w:r>
+    </w:p>
+    <w:p>
+      <w:pPr>
+        <w:keepNext/>
+        <w:shd w:fill="F3F3F3" w:val="clear"/>
+        <w:spacing w:after="0" w:before="0" w:line="260"/>
+        <w:ind w:left="120" w:right="120"/>
+      </w:pPr>
+      <w:r>
+        <w:rPr>
+          <w:rFonts w:ascii="Consolas" w:cs="Consolas" w:eastAsia="Consolas" w:hAnsi="Consolas"/>
+          <w:sz w:val="17"/>
+          <w:szCs w:val="17"/>
+        </w:rPr>
+        <w:t xml:space="preserve">      }</w:t>
+      </w:r>
+    </w:p>
+    <w:p>
+      <w:pPr>
+        <w:keepNext/>
+        <w:shd w:fill="F3F3F3" w:val="clear"/>
+        <w:spacing w:after="0" w:before="0" w:line="260"/>
+        <w:ind w:left="120" w:right="120"/>
+      </w:pPr>
+      <w:r>
+        <w:rPr>
+          <w:rFonts w:ascii="Consolas" w:cs="Consolas" w:eastAsia="Consolas" w:hAnsi="Consolas"/>
+          <w:sz w:val="17"/>
+          <w:szCs w:val="17"/>
+        </w:rPr>
+        <w:t xml:space="preserve">      if ($TcpPort -and -not $reach) {</w:t>
+      </w:r>
+    </w:p>
+    <w:p>
+      <w:pPr>
+        <w:keepNext/>
+        <w:shd w:fill="F3F3F3" w:val="clear"/>
+        <w:spacing w:after="0" w:before="0" w:line="260"/>
+        <w:ind w:left="120" w:right="120"/>
+      </w:pPr>
+      <w:r>
+        <w:rPr>
+          <w:rFonts w:ascii="Consolas" w:cs="Consolas" w:eastAsia="Consolas" w:hAnsi="Consolas"/>
+          <w:sz w:val="17"/>
+          <w:szCs w:val="17"/>
+        </w:rPr>
+        <w:t xml:space="preserve">        foreach ($port in $TcpPort) { if (Test-TcpPort $ip $port) { $reach = $true; break } }</w:t>
+      </w:r>
+    </w:p>
+    <w:p>
+      <w:pPr>
+        <w:keepNext/>
+        <w:shd w:fill="F3F3F3" w:val="clear"/>
+        <w:spacing w:after="0" w:before="0" w:line="260"/>
+        <w:ind w:left="120" w:right="120"/>
+      </w:pPr>
+      <w:r>
+        <w:rPr>
+          <w:rFonts w:ascii="Consolas" w:cs="Consolas" w:eastAsia="Consolas" w:hAnsi="Consolas"/>
+          <w:sz w:val="17"/>
+          <w:szCs w:val="17"/>
+        </w:rPr>
+        <w:t xml:space="preserve">        if (-not $reach) { $checks += "tcp $($TcpPort -join '/')" }</w:t>
+      </w:r>
+    </w:p>
+    <w:p>
+      <w:pPr>
+        <w:keepNext/>
+        <w:shd w:fill="F3F3F3" w:val="clear"/>
+        <w:spacing w:after="0" w:before="0" w:line="260"/>
+        <w:ind w:left="120" w:right="120"/>
+      </w:pPr>
+      <w:r>
+        <w:rPr>
+          <w:rFonts w:ascii="Consolas" w:cs="Consolas" w:eastAsia="Consolas" w:hAnsi="Consolas"/>
+          <w:sz w:val="17"/>
+          <w:szCs w:val="17"/>
+        </w:rPr>
+        <w:t xml:space="preserve">      }</w:t>
+      </w:r>
+    </w:p>
+    <w:p>
+      <w:pPr>
+        <w:keepNext/>
+        <w:shd w:fill="F3F3F3" w:val="clear"/>
+        <w:spacing w:after="0" w:before="0" w:line="260"/>
+        <w:ind w:left="120" w:right="120"/>
+      </w:pPr>
+      <w:r>
+        <w:rPr>
+          <w:rFonts w:ascii="Consolas" w:cs="Consolas" w:eastAsia="Consolas" w:hAnsi="Consolas"/>
+          <w:sz w:val="17"/>
+          <w:szCs w:val="17"/>
+        </w:rPr>
+        <w:t xml:space="preserve">      if (-not $reach) { $reasons += "$ip $($checks -join ' 與 ') 不通" }</w:t>
       </w:r>
     </w:p>
     <w:p>
@@ -9799,6 +11755,70 @@
           <w:sz w:val="17"/>
           <w:szCs w:val="17"/>
         </w:rPr>
+        <w:t xml:space="preserve">  # 網路可達 = guest 活著,優先於 Tools 判定。</w:t>
+      </w:r>
+    </w:p>
+    <w:p>
+      <w:pPr>
+        <w:keepNext/>
+        <w:shd w:fill="F3F3F3" w:val="clear"/>
+        <w:spacing w:after="0" w:before="0" w:line="260"/>
+        <w:ind w:left="120" w:right="120"/>
+      </w:pPr>
+      <w:r>
+        <w:rPr>
+          <w:rFonts w:ascii="Consolas" w:cs="Consolas" w:eastAsia="Consolas" w:hAnsi="Consolas"/>
+          <w:sz w:val="17"/>
+          <w:szCs w:val="17"/>
+        </w:rPr>
+        <w:t xml:space="preserve">  # 實測:移除 Tools 後 vCenter 仍回報 toolsNotRunning / guestToolsUnmanaged(舊值殘留,不會變 toolsNotInstalled),</w:t>
+      </w:r>
+    </w:p>
+    <w:p>
+      <w:pPr>
+        <w:keepNext/>
+        <w:shd w:fill="F3F3F3" w:val="clear"/>
+        <w:spacing w:after="0" w:before="0" w:line="260"/>
+        <w:ind w:left="120" w:right="120"/>
+      </w:pPr>
+      <w:r>
+        <w:rPr>
+          <w:rFonts w:ascii="Consolas" w:cs="Consolas" w:eastAsia="Consolas" w:hAnsi="Consolas"/>
+          <w:sz w:val="17"/>
+          <w:szCs w:val="17"/>
+        </w:rPr>
+        <w:t xml:space="preserve">  # 只看 Tools 會把「沒 Tools 但服務正常」的 VM 當成當機一直重開。</w:t>
+      </w:r>
+    </w:p>
+    <w:p>
+      <w:pPr>
+        <w:keepNext/>
+        <w:shd w:fill="F3F3F3" w:val="clear"/>
+        <w:spacing w:after="0" w:before="0" w:line="260"/>
+        <w:ind w:left="120" w:right="120"/>
+      </w:pPr>
+      <w:r>
+        <w:rPr>
+          <w:rFonts w:ascii="Consolas" w:cs="Consolas" w:eastAsia="Consolas" w:hAnsi="Consolas"/>
+          <w:sz w:val="17"/>
+          <w:szCs w:val="17"/>
+        </w:rPr>
+        <w:t xml:space="preserve">  if ($reachChecked -and $reach) { return @{ Healthy = $true; ToolsAlive = $toolsAlive } }</w:t>
+      </w:r>
+    </w:p>
+    <w:p>
+      <w:pPr>
+        <w:keepNext/>
+        <w:shd w:fill="F3F3F3" w:val="clear"/>
+        <w:spacing w:after="0" w:before="0" w:line="260"/>
+        <w:ind w:left="120" w:right="120"/>
+      </w:pPr>
+      <w:r>
+        <w:rPr>
+          <w:rFonts w:ascii="Consolas" w:cs="Consolas" w:eastAsia="Consolas" w:hAnsi="Consolas"/>
+          <w:sz w:val="17"/>
+          <w:szCs w:val="17"/>
+        </w:rPr>
         <w:t xml:space="preserve"> </w:t>
       </w:r>
     </w:p>
@@ -9831,7 +11851,7 @@
           <w:sz w:val="17"/>
           <w:szCs w:val="17"/>
         </w:rPr>
-        <w:t xml:space="preserve">  if (-not $toolsInstalled -and -not $ip) { return @{ Skip = $true; Reason = '沒裝 Tools 也沒 ping 目標,無法判定' } }</w:t>
+        <w:t xml:space="preserve">  if (-not $toolsInstalled -and -not $ip) { return @{ Skip = $true; Reason = '沒裝 Tools 也沒可達性目標(-PingMap / -ResolveDns),無法判定' } }</w:t>
       </w:r>
     </w:p>
     <w:p>
@@ -10967,7 +12987,7 @@
           <w:sz w:val="17"/>
           <w:szCs w:val="17"/>
         </w:rPr>
-        <w:t xml:space="preserve">Log ("=== Watch-VMHealth 啟動 server={0} vm={1} tag={2} threshold={3} grace={4}m ping={5} dryrun={6} ===" -f $Server, ($VmName -join ','), ($Tag -join ','), $FailThreshold, $BootGraceMinutes, $Ping, $DryRun)</w:t>
+        <w:t xml:space="preserve">Log ("=== Watch-VMHealth 啟動 server={0} vm={1} tag={2} threshold={3} grace={4}m ping={5} tcp={6} dns={7} dryrun={8} ===" -f $Server, ($VmName -join ','), ($Tag -join ','), $FailThreshold, $BootGraceMinutes, $Ping, ($TcpPort -join ','), $ResolveDns, $DryRun)</w:t>
       </w:r>
     </w:p>
     <w:p>

</xml_diff>